<commit_message>
Chapter: application section with gate and ward screenshots; app works on Streamlit 1.50
Co-Authored-By: Claude Opus 5.5 <noreply@anthropic.com>
</commit_message>
<xml_diff>
--- a/chapter/CAB_Sepsis_Chapter.docx
+++ b/chapter/CAB_Sepsis_Chapter.docx
@@ -399,7 +399,7 @@
         <w:t>A prototype application</w:t>
       </w:r>
       <w:r>
-        <w:t xml:space="preserve"> that runs the gate on a hospital's labels and then monitors patients hour by hour with whatever the gate switched on. It is built on the same code as the experiments (Section 3.9).</w:t>
+        <w:t xml:space="preserve"> that runs the gate on a hospital's labels and then monitors patients hour by hour with whatever the gate switched on. It is built on the same code as the experiments (Section 5).</w:t>
       </w:r>
     </w:p>
     <w:p>
@@ -4486,43 +4486,7 @@
         <w:t>CAB Sepsis Monitor</w:t>
       </w:r>
       <w:r>
-        <w:t>, built with Streamlit on the same code as the experiments. It has two parts:</w:t>
-      </w:r>
-    </w:p>
-    <w:p>
-      <w:pPr>
-        <w:pStyle w:val="ListBullet"/>
-      </w:pPr>
-      <w:r>
-        <w:rPr>
-          <w:b/>
-        </w:rPr>
-        <w:t>Deployment gate.</w:t>
-      </w:r>
-      <w:r>
-        <w:t xml:space="preserve"> An imported model arrives with its vendor threshold, and the gate runs CAB on the hospital's labelled patients. It shows the exact evidence for keep, calibrate, adapt or block: detections, false alerts, p-values and the certified threshold.</w:t>
-      </w:r>
-    </w:p>
-    <w:p>
-      <w:pPr>
-        <w:pStyle w:val="ListBullet"/>
-      </w:pPr>
-      <w:r>
-        <w:rPr>
-          <w:b/>
-        </w:rPr>
-        <w:t>Ward monitor.</w:t>
-      </w:r>
-      <w:r>
-        <w:t xml:space="preserve"> Test-set ICU patients are replayed hour by hour, using whatever the gate switched on, or modified NEWS2 if it blocked. The monitor shows a risk table, alerts, and risk and vital-sign trends.</w:t>
-      </w:r>
-    </w:p>
-    <w:p>
-      <w:pPr>
-        <w:jc w:val="both"/>
-      </w:pPr>
-      <w:r>
-        <w:t>An automated test confirms that the application's gate makes exactly the same decisions as the experiment code on 3,000 random cases. The prototype is not intended for clinical use.</w:t>
+        <w:t>, built on the same code as the experiments. It is described in Section 5.</w:t>
       </w:r>
     </w:p>
     <w:p>
@@ -8397,15 +8361,386 @@
         <w:pStyle w:val="Heading1"/>
       </w:pPr>
       <w:r>
-        <w:t>5 Discussion</w:t>
+        <w:t>5 Application: the CAB Sepsis Monitor</w:t>
       </w:r>
     </w:p>
     <w:p>
       <w:pPr>
+        <w:jc w:val="both"/>
+      </w:pPr>
+      <w:r>
+        <w:t>The prototype shows how the gate fits into a hospital's adoption of an external model. A safety officer runs the gate before anything reaches a ward, and clinicians later see which alerting system is in use and whether it was certified. It has two screens. The figures show the Beth Israel model being installed at Emory, with a random sample of 12,000 labelled patients. This sample is drawn by the application, so it differs from the one in Table 2.</w:t>
+      </w:r>
+    </w:p>
+    <w:p>
+      <w:pPr>
         <w:pStyle w:val="Heading2"/>
       </w:pPr>
       <w:r>
-        <w:t>5.1 Principal findings</w:t>
+        <w:t>5.1 Deployment gate</w:t>
+      </w:r>
+    </w:p>
+    <w:p>
+      <w:pPr>
+        <w:jc w:val="both"/>
+      </w:pPr>
+      <w:r>
+        <w:t>The deployment gate (Fig. 10) collects the three things CAB needs and nothing more:</w:t>
+      </w:r>
+    </w:p>
+    <w:p>
+      <w:pPr>
+        <w:keepNext/>
+        <w:jc w:val="center"/>
+      </w:pPr>
+      <w:r>
+        <w:drawing>
+          <wp:inline xmlns:a="http://schemas.openxmlformats.org/drawingml/2006/main" xmlns:pic="http://schemas.openxmlformats.org/drawingml/2006/picture">
+            <wp:extent cx="5580000" cy="6103125"/>
+            <wp:docPr id="10" name="Picture 10"/>
+            <wp:cNvGraphicFramePr>
+              <a:graphicFrameLocks noChangeAspect="1"/>
+            </wp:cNvGraphicFramePr>
+            <a:graphic>
+              <a:graphicData uri="http://schemas.openxmlformats.org/drawingml/2006/picture">
+                <pic:pic>
+                  <pic:nvPicPr>
+                    <pic:cNvPr id="0" name="fig_app_gate.png"/>
+                    <pic:cNvPicPr/>
+                  </pic:nvPicPr>
+                  <pic:blipFill>
+                    <a:blip r:embed="rId18"/>
+                    <a:stretch>
+                      <a:fillRect/>
+                    </a:stretch>
+                  </pic:blipFill>
+                  <pic:spPr>
+                    <a:xfrm>
+                      <a:off x="0" y="0"/>
+                      <a:ext cx="5580000" cy="6103125"/>
+                    </a:xfrm>
+                    <a:prstGeom prst="rect"/>
+                  </pic:spPr>
+                </pic:pic>
+              </a:graphicData>
+            </a:graphic>
+          </wp:inline>
+        </w:drawing>
+      </w:r>
+    </w:p>
+    <w:p>
+      <w:pPr>
+        <w:pStyle w:val="Caption"/>
+      </w:pPr>
+      <w:r>
+        <w:rPr>
+          <w:b/>
+        </w:rPr>
+        <w:t xml:space="preserve">Fig. 10 </w:t>
+      </w:r>
+      <w:r>
+        <w:t>The deployment gate of the prototype application: the hospital's requirements, its labelled patients and the vendor package (top); the decision, the evidence for each option, cheapest first, and the retrospective simulation check (bottom).</w:t>
+      </w:r>
+    </w:p>
+    <w:p>
+      <w:pPr>
+        <w:pStyle w:val="ListBullet"/>
+      </w:pPr>
+      <w:r>
+        <w:rPr>
+          <w:b/>
+        </w:rPr>
+        <w:t>The hospital's requirements.</w:t>
+      </w:r>
+      <w:r>
+        <w:t xml:space="preserve"> Two sliders set the sensitivity target and the extra false-alert rate the hospital will accept above the vendor's home rate.</w:t>
+      </w:r>
+    </w:p>
+    <w:p>
+      <w:pPr>
+        <w:pStyle w:val="ListBullet"/>
+      </w:pPr>
+      <w:r>
+        <w:rPr>
+          <w:b/>
+        </w:rPr>
+        <w:t>Its labelled patients.</w:t>
+      </w:r>
+      <w:r>
+        <w:t xml:space="preserve"> The user enters how many patients have been labelled and how they were chosen. Labels can be a random sample, or enriched so that half are septic. Enrichment keeps the tests valid, because sensitivity is estimated only from septic patients and false alerts only from non-septic ones.</w:t>
+      </w:r>
+    </w:p>
+    <w:p>
+      <w:pPr>
+        <w:pStyle w:val="ListBullet"/>
+      </w:pPr>
+      <w:r>
+        <w:rPr>
+          <w:b/>
+        </w:rPr>
+        <w:t>What arrived with the model.</w:t>
+      </w:r>
+      <w:r>
+        <w:t xml:space="preserve"> A "vendor package" panel shows the shipped threshold, the vendor's home validation counts, and the limits these imply at this hospital.</w:t>
+      </w:r>
+    </w:p>
+    <w:p>
+      <w:pPr>
+        <w:jc w:val="both"/>
+      </w:pPr>
+      <w:r>
+        <w:t xml:space="preserve">Pressing </w:t>
+      </w:r>
+      <w:r>
+        <w:rPr>
+          <w:i/>
+        </w:rPr>
+        <w:t>Run the gate</w:t>
+      </w:r>
+      <w:r>
+        <w:t xml:space="preserve"> shows three things:</w:t>
+      </w:r>
+    </w:p>
+    <w:p>
+      <w:pPr>
+        <w:pStyle w:val="ListBullet"/>
+      </w:pPr>
+      <w:r>
+        <w:t>the decision, as a coloured banner;</w:t>
+      </w:r>
+    </w:p>
+    <w:p>
+      <w:pPr>
+        <w:pStyle w:val="ListBullet"/>
+      </w:pPr>
+      <w:r>
+        <w:t>the evidence for each option, cheapest first: the counts, the exact bound and whether each test passed;</w:t>
+      </w:r>
+    </w:p>
+    <w:p>
+      <w:pPr>
+        <w:pStyle w:val="ListBullet"/>
+      </w:pPr>
+      <w:r>
+        <w:t>in this retrospective setting only, a simulation check of what each choice would have done on the patients the gate never saw.</w:t>
+      </w:r>
+    </w:p>
+    <w:p>
+      <w:pPr>
+        <w:jc w:val="both"/>
+      </w:pPr>
+      <w:r>
+        <w:t>In Fig. 10, keeping the model fails, because its sensitivity can only be proven to be at least 62.3%. Recalibration proves 80% sensitivity but fails the false-alert test, with an upper bound of 63.2% against a limit of 45.1%. The adapted model passes both tests (80.2% and 37.1%).</w:t>
+      </w:r>
+    </w:p>
+    <w:p>
+      <w:pPr>
+        <w:jc w:val="both"/>
+      </w:pPr>
+      <w:r>
+        <w:t>The simulation check shows why the proof matters. On 8,000 unseen patients, the adapted model detected 84.5% of septic patients and alerted 35.4% of non-septic patients. A simple, unproven recalibration that looked acceptable on the labelled patients would have alerted 55.6% of non-septic patients.</w:t>
+      </w:r>
+    </w:p>
+    <w:p>
+      <w:pPr>
+        <w:pStyle w:val="Heading2"/>
+      </w:pPr>
+      <w:r>
+        <w:t>5.2 Ward monitor</w:t>
+      </w:r>
+    </w:p>
+    <w:p>
+      <w:pPr>
+        <w:jc w:val="both"/>
+      </w:pPr>
+      <w:r>
+        <w:t>The ward monitor (Fig. 11) replays held-out ICU patients hour by hour, using whatever the gate switched on. If the gate blocked, it uses modified NEWS2. A header states which alerting system is in use and whether the gate certified it.</w:t>
+      </w:r>
+    </w:p>
+    <w:p>
+      <w:pPr>
+        <w:keepNext/>
+        <w:jc w:val="center"/>
+      </w:pPr>
+      <w:r>
+        <w:drawing>
+          <wp:inline xmlns:a="http://schemas.openxmlformats.org/drawingml/2006/main" xmlns:pic="http://schemas.openxmlformats.org/drawingml/2006/picture">
+            <wp:extent cx="5580000" cy="6385895"/>
+            <wp:docPr id="11" name="Picture 11"/>
+            <wp:cNvGraphicFramePr>
+              <a:graphicFrameLocks noChangeAspect="1"/>
+            </wp:cNvGraphicFramePr>
+            <a:graphic>
+              <a:graphicData uri="http://schemas.openxmlformats.org/drawingml/2006/picture">
+                <pic:pic>
+                  <pic:nvPicPr>
+                    <pic:cNvPr id="0" name="fig_app_ward.png"/>
+                    <pic:cNvPicPr/>
+                  </pic:nvPicPr>
+                  <pic:blipFill>
+                    <a:blip r:embed="rId19"/>
+                    <a:stretch>
+                      <a:fillRect/>
+                    </a:stretch>
+                  </pic:blipFill>
+                  <pic:spPr>
+                    <a:xfrm>
+                      <a:off x="0" y="0"/>
+                      <a:ext cx="5580000" cy="6385895"/>
+                    </a:xfrm>
+                    <a:prstGeom prst="rect"/>
+                  </pic:spPr>
+                </pic:pic>
+              </a:graphicData>
+            </a:graphic>
+          </wp:inline>
+        </w:drawing>
+      </w:r>
+    </w:p>
+    <w:p>
+      <w:pPr>
+        <w:pStyle w:val="Caption"/>
+      </w:pPr>
+      <w:r>
+        <w:rPr>
+          <w:b/>
+        </w:rPr>
+        <w:t xml:space="preserve">Fig. 11 </w:t>
+      </w:r>
+      <w:r>
+        <w:t>The ward monitor, replaying ICU patients at hour 24 with the adapted model certified in Fig. 10: the ward table with each patient's score relative to the threshold, alert status and 24-hour trend, and one patient's risk trajectory against the alert threshold.</w:t>
+      </w:r>
+    </w:p>
+    <w:p>
+      <w:pPr>
+        <w:jc w:val="both"/>
+      </w:pPr>
+      <w:r>
+        <w:rPr>
+          <w:b/>
+        </w:rPr>
+        <w:t>The ward table</w:t>
+      </w:r>
+      <w:r>
+        <w:t xml:space="preserve"> lists each bed with:</w:t>
+      </w:r>
+    </w:p>
+    <w:p>
+      <w:pPr>
+        <w:pStyle w:val="ListBullet"/>
+      </w:pPr>
+      <w:r>
+        <w:t>the current score relative to the alert threshold;</w:t>
+      </w:r>
+    </w:p>
+    <w:p>
+      <w:pPr>
+        <w:pStyle w:val="ListBullet"/>
+      </w:pPr>
+      <w:r>
+        <w:t>the alert status and how long the alert has been active;</w:t>
+      </w:r>
+    </w:p>
+    <w:p>
+      <w:pPr>
+        <w:pStyle w:val="ListBullet"/>
+      </w:pPr>
+      <w:r>
+        <w:t>a 24-hour trend.</w:t>
+      </w:r>
+    </w:p>
+    <w:p>
+      <w:pPr>
+        <w:jc w:val="both"/>
+      </w:pPr>
+      <w:r>
+        <w:rPr>
+          <w:b/>
+        </w:rPr>
+        <w:t>The patient view</w:t>
+      </w:r>
+      <w:r>
+        <w:t xml:space="preserve"> plots the risk score against the threshold, together with the main vital signs and laboratory results. A clinician can therefore see why an alert fired.</w:t>
+      </w:r>
+    </w:p>
+    <w:p>
+      <w:pPr>
+        <w:pStyle w:val="Heading2"/>
+      </w:pPr>
+      <w:r>
+        <w:t>5.3 Engineering</w:t>
+      </w:r>
+    </w:p>
+    <w:p>
+      <w:pPr>
+        <w:pStyle w:val="ListBullet"/>
+      </w:pPr>
+      <w:r>
+        <w:rPr>
+          <w:b/>
+        </w:rPr>
+        <w:t>One code path.</w:t>
+      </w:r>
+      <w:r>
+        <w:t xml:space="preserve"> The application calls the same gate function as the experiments. An automated test confirms identical decisions on 3,000 random cases covering all four outcomes.</w:t>
+      </w:r>
+    </w:p>
+    <w:p>
+      <w:pPr>
+        <w:pStyle w:val="ListBullet"/>
+      </w:pPr>
+      <w:r>
+        <w:rPr>
+          <w:b/>
+        </w:rPr>
+        <w:t>Runs locally.</w:t>
+      </w:r>
+      <w:r>
+        <w:t xml:space="preserve"> It runs on a single workstation, and no patient data leave it.</w:t>
+      </w:r>
+    </w:p>
+    <w:p>
+      <w:pPr>
+        <w:pStyle w:val="ListBullet"/>
+      </w:pPr>
+      <w:r>
+        <w:rPr>
+          <w:b/>
+        </w:rPr>
+        <w:t>The vendor package as a specification.</w:t>
+      </w:r>
+      <w:r>
+        <w:t xml:space="preserve"> It states the minimum a vendor must supply for a hospital to run the gate: the model, its threshold and its home validation counts. Ideally the vendor also supplies the full operating curve, so that the hospital can plan its labels with the calculator.</w:t>
+      </w:r>
+    </w:p>
+    <w:p>
+      <w:pPr>
+        <w:pStyle w:val="ListBullet"/>
+      </w:pPr>
+      <w:r>
+        <w:rPr>
+          <w:b/>
+        </w:rPr>
+        <w:t>Not yet deployable.</w:t>
+      </w:r>
+      <w:r>
+        <w:t xml:space="preserve"> Integration with an electronic health record, for example through HL7 FHIR, and prospective testing are needed before any clinical use. The prototype is not intended for clinical use.</w:t>
+      </w:r>
+    </w:p>
+    <w:p>
+      <w:pPr>
+        <w:pStyle w:val="Heading1"/>
+      </w:pPr>
+      <w:r>
+        <w:t>6 Discussion</w:t>
+      </w:r>
+    </w:p>
+    <w:p>
+      <w:pPr>
+        <w:pStyle w:val="Heading2"/>
+      </w:pPr>
+      <w:r>
+        <w:t>6.1 Principal findings</w:t>
       </w:r>
     </w:p>
     <w:p>
@@ -8463,7 +8798,7 @@
         <w:pStyle w:val="Heading2"/>
       </w:pPr>
       <w:r>
-        <w:t>5.2 Implications for hospitals and vendors</w:t>
+        <w:t>6.2 Implications for hospitals and vendors</w:t>
       </w:r>
     </w:p>
     <w:p>
@@ -8527,7 +8862,7 @@
         <w:pStyle w:val="Heading2"/>
       </w:pPr>
       <w:r>
-        <w:t>5.3 Limitations</w:t>
+        <w:t>6.3 Limitations</w:t>
       </w:r>
     </w:p>
     <w:p>
@@ -8633,7 +8968,7 @@
         <w:pStyle w:val="Heading2"/>
       </w:pPr>
       <w:r>
-        <w:t>5.4 Future work</w:t>
+        <w:t>6.4 Future work</w:t>
       </w:r>
     </w:p>
     <w:p>
@@ -8761,7 +9096,7 @@
         <w:pStyle w:val="Heading1"/>
       </w:pPr>
       <w:r>
-        <w:t>6 Conclusion</w:t>
+        <w:t>7 Conclusion</w:t>
       </w:r>
     </w:p>
     <w:p>

</xml_diff>

<commit_message>
Lead time (E13), label noise (E14) and shorter window (E15) analyses; chapter section 4.8
Co-Authored-By: Claude Opus 5.5 <noreply@anthropic.com>
</commit_message>
<xml_diff>
--- a/chapter/CAB_Sepsis_Chapter.docx
+++ b/chapter/CAB_Sepsis_Chapter.docx
@@ -5521,7 +5521,7 @@
         <w:jc w:val="both"/>
       </w:pPr>
       <w:r>
-        <w:t>Fig. 4 shows, for the primary criterion, the share of runs in which each policy switched on an unsafe deployment. Fig. 5 averages over all criteria and budgets.</w:t>
+        <w:t>Fig. 4 shows, for the primary criterion, the share of runs in which each policy switched on an unsafe deployment. Supplementary Fig. S1 averages over all criteria and budgets.</w:t>
       </w:r>
     </w:p>
     <w:p>
@@ -5580,60 +5580,6 @@
     </w:p>
     <w:p>
       <w:pPr>
-        <w:keepNext/>
-        <w:jc w:val="center"/>
-      </w:pPr>
-      <w:r>
-        <w:drawing>
-          <wp:inline xmlns:a="http://schemas.openxmlformats.org/drawingml/2006/main" xmlns:pic="http://schemas.openxmlformats.org/drawingml/2006/picture">
-            <wp:extent cx="5580000" cy="1916310"/>
-            <wp:docPr id="5" name="Picture 5"/>
-            <wp:cNvGraphicFramePr>
-              <a:graphicFrameLocks noChangeAspect="1"/>
-            </wp:cNvGraphicFramePr>
-            <a:graphic>
-              <a:graphicData uri="http://schemas.openxmlformats.org/drawingml/2006/picture">
-                <pic:pic>
-                  <pic:nvPicPr>
-                    <pic:cNvPr id="0" name="fig4_overall.png"/>
-                    <pic:cNvPicPr/>
-                  </pic:nvPicPr>
-                  <pic:blipFill>
-                    <a:blip r:embed="rId13"/>
-                    <a:stretch>
-                      <a:fillRect/>
-                    </a:stretch>
-                  </pic:blipFill>
-                  <pic:spPr>
-                    <a:xfrm>
-                      <a:off x="0" y="0"/>
-                      <a:ext cx="5580000" cy="1916310"/>
-                    </a:xfrm>
-                    <a:prstGeom prst="rect"/>
-                  </pic:spPr>
-                </pic:pic>
-              </a:graphicData>
-            </a:graphic>
-          </wp:inline>
-        </w:drawing>
-      </w:r>
-    </w:p>
-    <w:p>
-      <w:pPr>
-        <w:pStyle w:val="Caption"/>
-      </w:pPr>
-      <w:r>
-        <w:rPr>
-          <w:b/>
-        </w:rPr>
-        <w:t xml:space="preserve">Fig. 5 </w:t>
-      </w:r>
-      <w:r>
-        <w:t>Unsafe and silent-failure rates per policy, averaged over all scenarios, criteria and budgets.</w:t>
-      </w:r>
-    </w:p>
-    <w:p>
-      <w:pPr>
         <w:jc w:val="both"/>
       </w:pPr>
       <w:r>
@@ -5643,7 +5589,7 @@
         <w:t>Conventional policies were unsafe in most runs</w:t>
       </w:r>
       <w:r>
-        <w:t xml:space="preserve"> (Fig. 5):</w:t>
+        <w:t xml:space="preserve"> (Supplementary Fig. S1):</w:t>
       </w:r>
     </w:p>
     <w:tbl>
@@ -6446,7 +6392,7 @@
         <w:jc w:val="both"/>
       </w:pPr>
       <w:r>
-        <w:t>Fig. 6 compares CAB with the alternatives a hospital is most likely to use instead.</w:t>
+        <w:t>Fig. 5 compares CAB with the alternatives a hospital is most likely to use instead.</w:t>
       </w:r>
     </w:p>
     <w:p>
@@ -6458,7 +6404,7 @@
         <w:drawing>
           <wp:inline xmlns:a="http://schemas.openxmlformats.org/drawingml/2006/main" xmlns:pic="http://schemas.openxmlformats.org/drawingml/2006/picture">
             <wp:extent cx="5580000" cy="2234676"/>
-            <wp:docPr id="6" name="Picture 6"/>
+            <wp:docPr id="5" name="Picture 5"/>
             <wp:cNvGraphicFramePr>
               <a:graphicFrameLocks noChangeAspect="1"/>
             </wp:cNvGraphicFramePr>
@@ -6470,7 +6416,7 @@
                     <pic:cNvPicPr/>
                   </pic:nvPicPr>
                   <pic:blipFill>
-                    <a:blip r:embed="rId14"/>
+                    <a:blip r:embed="rId13"/>
                     <a:stretch>
                       <a:fillRect/>
                     </a:stretch>
@@ -6497,7 +6443,7 @@
         <w:rPr>
           <w:b/>
         </w:rPr>
-        <w:t xml:space="preserve">Fig. 6 </w:t>
+        <w:t xml:space="preserve">Fig. 5 </w:t>
       </w:r>
       <w:r>
         <w:t>CAB against practical alternatives: unsafe and correct decisions, cross-hospital and home control.</w:t>
@@ -6600,61 +6546,7 @@
         <w:jc w:val="both"/>
       </w:pPr>
       <w:r>
-        <w:t>Every setting was repeated 100 times, so its measured unsafe rate is a binomial proportion with sampling error. Fig. 8 plots each setting's measured rate against the nominal level α for α = 0.01, 0.05 and 0.10. Table 5 summarises it.</w:t>
-      </w:r>
-    </w:p>
-    <w:p>
-      <w:pPr>
-        <w:keepNext/>
-        <w:jc w:val="center"/>
-      </w:pPr>
-      <w:r>
-        <w:drawing>
-          <wp:inline xmlns:a="http://schemas.openxmlformats.org/drawingml/2006/main" xmlns:pic="http://schemas.openxmlformats.org/drawingml/2006/picture">
-            <wp:extent cx="5580000" cy="2520300"/>
-            <wp:docPr id="7" name="Picture 7"/>
-            <wp:cNvGraphicFramePr>
-              <a:graphicFrameLocks noChangeAspect="1"/>
-            </wp:cNvGraphicFramePr>
-            <a:graphic>
-              <a:graphicData uri="http://schemas.openxmlformats.org/drawingml/2006/picture">
-                <pic:pic>
-                  <pic:nvPicPr>
-                    <pic:cNvPr id="0" name="fig7_validity.png"/>
-                    <pic:cNvPicPr/>
-                  </pic:nvPicPr>
-                  <pic:blipFill>
-                    <a:blip r:embed="rId15"/>
-                    <a:stretch>
-                      <a:fillRect/>
-                    </a:stretch>
-                  </pic:blipFill>
-                  <pic:spPr>
-                    <a:xfrm>
-                      <a:off x="0" y="0"/>
-                      <a:ext cx="5580000" cy="2520300"/>
-                    </a:xfrm>
-                    <a:prstGeom prst="rect"/>
-                  </pic:spPr>
-                </pic:pic>
-              </a:graphicData>
-            </a:graphic>
-          </wp:inline>
-        </w:drawing>
-      </w:r>
-    </w:p>
-    <w:p>
-      <w:pPr>
-        <w:pStyle w:val="Caption"/>
-      </w:pPr>
-      <w:r>
-        <w:rPr>
-          <w:b/>
-        </w:rPr>
-        <w:t xml:space="preserve">Fig. 8 </w:t>
-      </w:r>
-      <w:r>
-        <w:t>Measured unsafe rate of every setting against the nominal α.</w:t>
+        <w:t>Every setting was repeated 100 times, so its measured unsafe rate is a binomial proportion with sampling error. Supplementary Fig. S2 plots each setting's measured rate against the nominal level α for α = 0.01, 0.05 and 0.10. Table 5 summarises it.</w:t>
       </w:r>
     </w:p>
     <w:p>
@@ -7696,7 +7588,7 @@
         <w:t>The calculator.</w:t>
       </w:r>
       <w:r>
-        <w:t xml:space="preserve"> The labels needed fall steeply as the model's margin over the target grows (Fig. 7). To certify sensitivity at s* = 0.80, the calculator requires:</w:t>
+        <w:t xml:space="preserve"> The labels needed fall steeply as the model's margin over the target grows (Fig. 6a). To certify sensitivity at s* = 0.80, the calculator requires:</w:t>
       </w:r>
     </w:p>
     <w:p>
@@ -7707,8 +7599,8 @@
       <w:r>
         <w:drawing>
           <wp:inline xmlns:a="http://schemas.openxmlformats.org/drawingml/2006/main" xmlns:pic="http://schemas.openxmlformats.org/drawingml/2006/picture">
-            <wp:extent cx="5580000" cy="3989368"/>
-            <wp:docPr id="8" name="Picture 8"/>
+            <wp:extent cx="5580000" cy="2343969"/>
+            <wp:docPr id="6" name="Picture 6"/>
             <wp:cNvGraphicFramePr>
               <a:graphicFrameLocks noChangeAspect="1"/>
             </wp:cNvGraphicFramePr>
@@ -7716,11 +7608,11 @@
               <a:graphicData uri="http://schemas.openxmlformats.org/drawingml/2006/picture">
                 <pic:pic>
                   <pic:nvPicPr>
-                    <pic:cNvPr id="0" name="fig6_labels.png"/>
+                    <pic:cNvPr id="0" name="fig_labels_tolerance.png"/>
                     <pic:cNvPicPr/>
                   </pic:nvPicPr>
                   <pic:blipFill>
-                    <a:blip r:embed="rId16"/>
+                    <a:blip r:embed="rId14"/>
                     <a:stretch>
                       <a:fillRect/>
                     </a:stretch>
@@ -7728,7 +7620,7 @@
                   <pic:spPr>
                     <a:xfrm>
                       <a:off x="0" y="0"/>
-                      <a:ext cx="5580000" cy="3989368"/>
+                      <a:ext cx="5580000" cy="2343969"/>
                     </a:xfrm>
                     <a:prstGeom prst="rect"/>
                   </pic:spPr>
@@ -7747,10 +7639,10 @@
         <w:rPr>
           <w:b/>
         </w:rPr>
-        <w:t xml:space="preserve">Fig. 7 </w:t>
-      </w:r>
-      <w:r>
-        <w:t>Septic patients needed to certify sensitivity, by the true margin over the target.</w:t>
+        <w:t xml:space="preserve">Fig. 6 </w:t>
+      </w:r>
+      <w:r>
+        <w:t>What certification costs, and what moves it. (a) Septic patients needed to certify sensitivity, by the model's true margin over the target (calculator; power 0.9, α/4 per test). (b, c) Share of runs in which CAB approved the unchanged model at home, by the hospital's false-alert tolerance (models held fixed).</w:t>
       </w:r>
     </w:p>
     <w:tbl>
@@ -8093,61 +7985,7 @@
         <w:t>Headroom.</w:t>
       </w:r>
       <w:r>
-        <w:t xml:space="preserve"> One might expect a vendor to make certification easier by shipping a threshold with extra headroom above the sensitivity target. We varied that headroom from 0 to 10 points (Fig. 9). Approval at home did not change: about 46% of runs at hospital A and 66% at hospital B, averaged over budgets.</w:t>
-      </w:r>
-    </w:p>
-    <w:p>
-      <w:pPr>
-        <w:keepNext/>
-        <w:jc w:val="center"/>
-      </w:pPr>
-      <w:r>
-        <w:drawing>
-          <wp:inline xmlns:a="http://schemas.openxmlformats.org/drawingml/2006/main" xmlns:pic="http://schemas.openxmlformats.org/drawingml/2006/picture">
-            <wp:extent cx="5580000" cy="2773110"/>
-            <wp:docPr id="9" name="Picture 9"/>
-            <wp:cNvGraphicFramePr>
-              <a:graphicFrameLocks noChangeAspect="1"/>
-            </wp:cNvGraphicFramePr>
-            <a:graphic>
-              <a:graphicData uri="http://schemas.openxmlformats.org/drawingml/2006/picture">
-                <pic:pic>
-                  <pic:nvPicPr>
-                    <pic:cNvPr id="0" name="fig8_tolerance.png"/>
-                    <pic:cNvPicPr/>
-                  </pic:nvPicPr>
-                  <pic:blipFill>
-                    <a:blip r:embed="rId17"/>
-                    <a:stretch>
-                      <a:fillRect/>
-                    </a:stretch>
-                  </pic:blipFill>
-                  <pic:spPr>
-                    <a:xfrm>
-                      <a:off x="0" y="0"/>
-                      <a:ext cx="5580000" cy="2773110"/>
-                    </a:xfrm>
-                    <a:prstGeom prst="rect"/>
-                  </pic:spPr>
-                </pic:pic>
-              </a:graphicData>
-            </a:graphic>
-          </wp:inline>
-        </w:drawing>
-      </w:r>
-    </w:p>
-    <w:p>
-      <w:pPr>
-        <w:pStyle w:val="Caption"/>
-      </w:pPr>
-      <w:r>
-        <w:rPr>
-          <w:b/>
-        </w:rPr>
-        <w:t xml:space="preserve">Fig. 9 </w:t>
-      </w:r>
-      <w:r>
-        <w:t>Approval at home by the hospital's false-alert tolerance (models held fixed).</w:t>
+        <w:t xml:space="preserve"> One might expect a vendor to make certification easier by shipping a threshold with extra headroom above the sensitivity target. We varied that headroom from 0 to 10 points (Fig. 6b–c). Approval at home did not change: about 46% of runs at hospital A and 66% at hospital B, averaged over budgets.</w:t>
       </w:r>
     </w:p>
     <w:p>
@@ -8169,7 +8007,7 @@
         <w:t>Tolerance.</w:t>
       </w:r>
       <w:r>
-        <w:t xml:space="preserve"> What did change approval was the hospital's false-alert tolerance m (Fig. 9). With 8,000 labels, approval at hospital A was:</w:t>
+        <w:t xml:space="preserve"> What did change approval was the hospital's false-alert tolerance m (Fig. 6b–c). With 8,000 labels, approval at hospital A was:</w:t>
       </w:r>
     </w:p>
     <w:tbl>
@@ -8358,6 +8196,681 @@
     </w:p>
     <w:p>
       <w:pPr>
+        <w:pStyle w:val="Heading2"/>
+      </w:pPr>
+      <w:r>
+        <w:t>4.8 Lead time and robustness</w:t>
+      </w:r>
+    </w:p>
+    <w:p>
+      <w:pPr>
+        <w:jc w:val="both"/>
+      </w:pPr>
+      <w:r>
+        <w:rPr>
+          <w:b/>
+        </w:rPr>
+        <w:t>Lead time.</w:t>
+      </w:r>
+      <w:r>
+        <w:t xml:space="preserve"> Certification did not cost early warning (Table 6). In A→B with 12,000 labels, the models CAB switched on:</w:t>
+      </w:r>
+    </w:p>
+    <w:p>
+      <w:pPr>
+        <w:pStyle w:val="ListBullet"/>
+      </w:pPr>
+      <w:r>
+        <w:t>detected 85% of septic patients in the window;</w:t>
+      </w:r>
+    </w:p>
+    <w:p>
+      <w:pPr>
+        <w:pStyle w:val="ListBullet"/>
+      </w:pPr>
+      <w:r>
+        <w:t>alerted 64% of all septic patients at least 6 h before onset, the highest share of any policy.</w:t>
+      </w:r>
+    </w:p>
+    <w:p>
+      <w:pPr>
+        <w:jc w:val="both"/>
+      </w:pPr>
+      <w:r>
+        <w:t>Recalibration and fine-tuning alerted 58–59% that early, and the imported model as supplied 44%. The imported model's later-looking median of 11.9 h comes from detecting fewer patients, not from earlier alerts. Lead times are capped at 12 h by the detection window.</w:t>
+      </w:r>
+    </w:p>
+    <w:p>
+      <w:pPr>
+        <w:keepNext/>
+        <w:jc w:val="both"/>
+      </w:pPr>
+      <w:r>
+        <w:rPr>
+          <w:b/>
+        </w:rPr>
+        <w:t>Table 6.</w:t>
+      </w:r>
+      <w:r>
+        <w:t xml:space="preserve"> Lead time before sepsis onset, A→B, 12,000 labels, primary criterion (20 runs; the two reference rows are single evaluations on the target's test patients).</w:t>
+      </w:r>
+    </w:p>
+    <w:tbl>
+      <w:tblPr>
+        <w:tblW w:type="auto" w:w="0"/>
+        <w:jc w:val="center"/>
+        <w:tblLook w:firstColumn="1" w:firstRow="1" w:lastColumn="0" w:lastRow="0" w:noHBand="0" w:noVBand="1" w:val="04A0"/>
+        <w:tblBorders>
+          <w:top w:val="single" w:sz="6" w:color="000000"/>
+          <w:bottom w:val="single" w:sz="6" w:color="000000"/>
+          <w:insideH w:val="nil" w:sz="6" w:color="000000"/>
+          <w:insideV w:val="nil" w:sz="6" w:color="000000"/>
+          <w:left w:val="nil" w:sz="6" w:color="000000"/>
+          <w:right w:val="nil" w:sz="6" w:color="000000"/>
+        </w:tblBorders>
+      </w:tblPr>
+      <w:tblGrid>
+        <w:gridCol w:w="2268"/>
+        <w:gridCol w:w="2268"/>
+        <w:gridCol w:w="2268"/>
+        <w:gridCol w:w="2268"/>
+      </w:tblGrid>
+      <w:tr>
+        <w:tc>
+          <w:tcPr>
+            <w:tcW w:type="dxa" w:w="2268"/>
+            <w:tcBorders>
+              <w:bottom w:val="single" w:sz="4" w:color="000000"/>
+            </w:tcBorders>
+          </w:tcPr>
+          <w:p>
+            <w:pPr>
+              <w:spacing w:after="20"/>
+            </w:pPr>
+            <w:r>
+              <w:rPr>
+                <w:b/>
+                <w:sz w:val="17"/>
+              </w:rPr>
+              <w:t>Alerting system</w:t>
+            </w:r>
+          </w:p>
+        </w:tc>
+        <w:tc>
+          <w:tcPr>
+            <w:tcW w:type="dxa" w:w="2268"/>
+            <w:tcBorders>
+              <w:bottom w:val="single" w:sz="4" w:color="000000"/>
+            </w:tcBorders>
+          </w:tcPr>
+          <w:p>
+            <w:pPr>
+              <w:spacing w:after="20"/>
+            </w:pPr>
+            <w:r>
+              <w:rPr>
+                <w:b/>
+                <w:sz w:val="17"/>
+              </w:rPr>
+              <w:t>Septic patients detected</w:t>
+            </w:r>
+          </w:p>
+        </w:tc>
+        <w:tc>
+          <w:tcPr>
+            <w:tcW w:type="dxa" w:w="2268"/>
+            <w:tcBorders>
+              <w:bottom w:val="single" w:sz="4" w:color="000000"/>
+            </w:tcBorders>
+          </w:tcPr>
+          <w:p>
+            <w:pPr>
+              <w:spacing w:after="20"/>
+            </w:pPr>
+            <w:r>
+              <w:rPr>
+                <w:b/>
+                <w:sz w:val="17"/>
+              </w:rPr>
+              <w:t>Median lead time, h (IQR)</w:t>
+            </w:r>
+          </w:p>
+        </w:tc>
+        <w:tc>
+          <w:tcPr>
+            <w:tcW w:type="dxa" w:w="2268"/>
+            <w:tcBorders>
+              <w:bottom w:val="single" w:sz="4" w:color="000000"/>
+            </w:tcBorders>
+          </w:tcPr>
+          <w:p>
+            <w:pPr>
+              <w:spacing w:after="20"/>
+            </w:pPr>
+            <w:r>
+              <w:rPr>
+                <w:b/>
+                <w:sz w:val="17"/>
+              </w:rPr>
+              <w:t>Alerted ≥ 6 h before onset</w:t>
+            </w:r>
+          </w:p>
+        </w:tc>
+      </w:tr>
+      <w:tr>
+        <w:tc>
+          <w:tcPr>
+            <w:tcW w:type="dxa" w:w="2268"/>
+          </w:tcPr>
+          <w:p>
+            <w:pPr>
+              <w:spacing w:after="20"/>
+            </w:pPr>
+            <w:r>
+              <w:rPr>
+                <w:sz w:val="17"/>
+              </w:rPr>
+              <w:t>CAB (adapted model)</w:t>
+            </w:r>
+          </w:p>
+        </w:tc>
+        <w:tc>
+          <w:tcPr>
+            <w:tcW w:type="dxa" w:w="2268"/>
+          </w:tcPr>
+          <w:p>
+            <w:pPr>
+              <w:spacing w:after="20"/>
+            </w:pPr>
+            <w:r>
+              <w:rPr>
+                <w:sz w:val="17"/>
+              </w:rPr>
+              <w:t>85%</w:t>
+            </w:r>
+          </w:p>
+        </w:tc>
+        <w:tc>
+          <w:tcPr>
+            <w:tcW w:type="dxa" w:w="2268"/>
+          </w:tcPr>
+          <w:p>
+            <w:pPr>
+              <w:spacing w:after="20"/>
+            </w:pPr>
+            <w:r>
+              <w:rPr>
+                <w:sz w:val="17"/>
+              </w:rPr>
+              <w:t>10.7 (5.7–12)</w:t>
+            </w:r>
+          </w:p>
+        </w:tc>
+        <w:tc>
+          <w:tcPr>
+            <w:tcW w:type="dxa" w:w="2268"/>
+          </w:tcPr>
+          <w:p>
+            <w:pPr>
+              <w:spacing w:after="20"/>
+            </w:pPr>
+            <w:r>
+              <w:rPr>
+                <w:sz w:val="17"/>
+              </w:rPr>
+              <w:t>64%</w:t>
+            </w:r>
+          </w:p>
+        </w:tc>
+      </w:tr>
+      <w:tr>
+        <w:tc>
+          <w:tcPr>
+            <w:tcW w:type="dxa" w:w="2268"/>
+          </w:tcPr>
+          <w:p>
+            <w:pPr>
+              <w:spacing w:after="20"/>
+            </w:pPr>
+            <w:r>
+              <w:rPr>
+                <w:sz w:val="17"/>
+              </w:rPr>
+              <w:t>Recalibration</w:t>
+            </w:r>
+          </w:p>
+        </w:tc>
+        <w:tc>
+          <w:tcPr>
+            <w:tcW w:type="dxa" w:w="2268"/>
+          </w:tcPr>
+          <w:p>
+            <w:pPr>
+              <w:spacing w:after="20"/>
+            </w:pPr>
+            <w:r>
+              <w:rPr>
+                <w:sz w:val="17"/>
+              </w:rPr>
+              <w:t>82%</w:t>
+            </w:r>
+          </w:p>
+        </w:tc>
+        <w:tc>
+          <w:tcPr>
+            <w:tcW w:type="dxa" w:w="2268"/>
+          </w:tcPr>
+          <w:p>
+            <w:pPr>
+              <w:spacing w:after="20"/>
+            </w:pPr>
+            <w:r>
+              <w:rPr>
+                <w:sz w:val="17"/>
+              </w:rPr>
+              <w:t>11.4 (5.1–12)</w:t>
+            </w:r>
+          </w:p>
+        </w:tc>
+        <w:tc>
+          <w:tcPr>
+            <w:tcW w:type="dxa" w:w="2268"/>
+          </w:tcPr>
+          <w:p>
+            <w:pPr>
+              <w:spacing w:after="20"/>
+            </w:pPr>
+            <w:r>
+              <w:rPr>
+                <w:sz w:val="17"/>
+              </w:rPr>
+              <w:t>59%</w:t>
+            </w:r>
+          </w:p>
+        </w:tc>
+      </w:tr>
+      <w:tr>
+        <w:tc>
+          <w:tcPr>
+            <w:tcW w:type="dxa" w:w="2268"/>
+          </w:tcPr>
+          <w:p>
+            <w:pPr>
+              <w:spacing w:after="20"/>
+            </w:pPr>
+            <w:r>
+              <w:rPr>
+                <w:sz w:val="17"/>
+              </w:rPr>
+              <w:t>Fine-tuning</w:t>
+            </w:r>
+          </w:p>
+        </w:tc>
+        <w:tc>
+          <w:tcPr>
+            <w:tcW w:type="dxa" w:w="2268"/>
+          </w:tcPr>
+          <w:p>
+            <w:pPr>
+              <w:spacing w:after="20"/>
+            </w:pPr>
+            <w:r>
+              <w:rPr>
+                <w:sz w:val="17"/>
+              </w:rPr>
+              <w:t>80%</w:t>
+            </w:r>
+          </w:p>
+        </w:tc>
+        <w:tc>
+          <w:tcPr>
+            <w:tcW w:type="dxa" w:w="2268"/>
+          </w:tcPr>
+          <w:p>
+            <w:pPr>
+              <w:spacing w:after="20"/>
+            </w:pPr>
+            <w:r>
+              <w:rPr>
+                <w:sz w:val="17"/>
+              </w:rPr>
+              <w:t>9.7 (5.2–12)</w:t>
+            </w:r>
+          </w:p>
+        </w:tc>
+        <w:tc>
+          <w:tcPr>
+            <w:tcW w:type="dxa" w:w="2268"/>
+          </w:tcPr>
+          <w:p>
+            <w:pPr>
+              <w:spacing w:after="20"/>
+            </w:pPr>
+            <w:r>
+              <w:rPr>
+                <w:sz w:val="17"/>
+              </w:rPr>
+              <w:t>58%</w:t>
+            </w:r>
+          </w:p>
+        </w:tc>
+      </w:tr>
+      <w:tr>
+        <w:tc>
+          <w:tcPr>
+            <w:tcW w:type="dxa" w:w="2268"/>
+          </w:tcPr>
+          <w:p>
+            <w:pPr>
+              <w:spacing w:after="20"/>
+            </w:pPr>
+            <w:r>
+              <w:rPr>
+                <w:sz w:val="17"/>
+              </w:rPr>
+              <w:t>Imported model, as supplied</w:t>
+            </w:r>
+          </w:p>
+        </w:tc>
+        <w:tc>
+          <w:tcPr>
+            <w:tcW w:type="dxa" w:w="2268"/>
+          </w:tcPr>
+          <w:p>
+            <w:pPr>
+              <w:spacing w:after="20"/>
+            </w:pPr>
+            <w:r>
+              <w:rPr>
+                <w:sz w:val="17"/>
+              </w:rPr>
+              <w:t>68%</w:t>
+            </w:r>
+          </w:p>
+        </w:tc>
+        <w:tc>
+          <w:tcPr>
+            <w:tcW w:type="dxa" w:w="2268"/>
+          </w:tcPr>
+          <w:p>
+            <w:pPr>
+              <w:spacing w:after="20"/>
+            </w:pPr>
+            <w:r>
+              <w:rPr>
+                <w:sz w:val="17"/>
+              </w:rPr>
+              <w:t>11.9 (3.7–12)</w:t>
+            </w:r>
+          </w:p>
+        </w:tc>
+        <w:tc>
+          <w:tcPr>
+            <w:tcW w:type="dxa" w:w="2268"/>
+          </w:tcPr>
+          <w:p>
+            <w:pPr>
+              <w:spacing w:after="20"/>
+            </w:pPr>
+            <w:r>
+              <w:rPr>
+                <w:sz w:val="17"/>
+              </w:rPr>
+              <w:t>44%</w:t>
+            </w:r>
+          </w:p>
+        </w:tc>
+      </w:tr>
+      <w:tr>
+        <w:tc>
+          <w:tcPr>
+            <w:tcW w:type="dxa" w:w="2268"/>
+          </w:tcPr>
+          <w:p>
+            <w:pPr>
+              <w:spacing w:after="20"/>
+            </w:pPr>
+            <w:r>
+              <w:rPr>
+                <w:sz w:val="17"/>
+              </w:rPr>
+              <w:t>Hospital's own local model</w:t>
+            </w:r>
+          </w:p>
+        </w:tc>
+        <w:tc>
+          <w:tcPr>
+            <w:tcW w:type="dxa" w:w="2268"/>
+          </w:tcPr>
+          <w:p>
+            <w:pPr>
+              <w:spacing w:after="20"/>
+            </w:pPr>
+            <w:r>
+              <w:rPr>
+                <w:sz w:val="17"/>
+              </w:rPr>
+              <w:t>80%</w:t>
+            </w:r>
+          </w:p>
+        </w:tc>
+        <w:tc>
+          <w:tcPr>
+            <w:tcW w:type="dxa" w:w="2268"/>
+          </w:tcPr>
+          <w:p>
+            <w:pPr>
+              <w:spacing w:after="20"/>
+            </w:pPr>
+            <w:r>
+              <w:rPr>
+                <w:sz w:val="17"/>
+              </w:rPr>
+              <w:t>7.0 (5.0–12)</w:t>
+            </w:r>
+          </w:p>
+        </w:tc>
+        <w:tc>
+          <w:tcPr>
+            <w:tcW w:type="dxa" w:w="2268"/>
+          </w:tcPr>
+          <w:p>
+            <w:pPr>
+              <w:spacing w:after="20"/>
+            </w:pPr>
+            <w:r>
+              <w:rPr>
+                <w:sz w:val="17"/>
+              </w:rPr>
+              <w:t>58%</w:t>
+            </w:r>
+          </w:p>
+        </w:tc>
+      </w:tr>
+      <w:tr>
+        <w:tc>
+          <w:tcPr>
+            <w:tcW w:type="dxa" w:w="2268"/>
+          </w:tcPr>
+          <w:p>
+            <w:pPr>
+              <w:spacing w:after="20"/>
+            </w:pPr>
+            <w:r>
+              <w:rPr>
+                <w:sz w:val="17"/>
+              </w:rPr>
+              <w:t>Modified NEWS2 ≥ 5</w:t>
+            </w:r>
+          </w:p>
+        </w:tc>
+        <w:tc>
+          <w:tcPr>
+            <w:tcW w:type="dxa" w:w="2268"/>
+          </w:tcPr>
+          <w:p>
+            <w:pPr>
+              <w:spacing w:after="20"/>
+            </w:pPr>
+            <w:r>
+              <w:rPr>
+                <w:sz w:val="17"/>
+              </w:rPr>
+              <w:t>79%</w:t>
+            </w:r>
+          </w:p>
+        </w:tc>
+        <w:tc>
+          <w:tcPr>
+            <w:tcW w:type="dxa" w:w="2268"/>
+          </w:tcPr>
+          <w:p>
+            <w:pPr>
+              <w:spacing w:after="20"/>
+            </w:pPr>
+            <w:r>
+              <w:rPr>
+                <w:sz w:val="17"/>
+              </w:rPr>
+              <w:t>8.0 (3.8–12)</w:t>
+            </w:r>
+          </w:p>
+        </w:tc>
+        <w:tc>
+          <w:tcPr>
+            <w:tcW w:type="dxa" w:w="2268"/>
+          </w:tcPr>
+          <w:p>
+            <w:pPr>
+              <w:spacing w:after="20"/>
+            </w:pPr>
+            <w:r>
+              <w:rPr>
+                <w:sz w:val="17"/>
+              </w:rPr>
+              <w:t>49%</w:t>
+            </w:r>
+          </w:p>
+        </w:tc>
+      </w:tr>
+    </w:tbl>
+    <w:p>
+      <w:pPr>
+        <w:spacing w:after="40"/>
+      </w:pPr>
+    </w:p>
+    <w:p>
+      <w:pPr>
+        <w:jc w:val="both"/>
+      </w:pPr>
+      <w:r>
+        <w:rPr>
+          <w:b/>
+        </w:rPr>
+        <w:t>A shorter detection window.</w:t>
+      </w:r>
+      <w:r>
+        <w:t xml:space="preserve"> We repeated the cross-hospital experiment counting a septic patient as detected only from 6 h, rather than 12 h, before onset. This used 30 repeats and budgets of 1,000, 4,000 and 12,000 labels. The correct remedies were unchanged at the primary criterion: ADAPT for A→B and BLOCK for B→A. The conclusions did not change either:</w:t>
+      </w:r>
+    </w:p>
+    <w:p>
+      <w:pPr>
+        <w:pStyle w:val="ListBullet"/>
+      </w:pPr>
+      <w:r>
+        <w:t>CAB was unsafe in 0.9% of runs on average (worst setting 3.3%);</w:t>
+      </w:r>
+    </w:p>
+    <w:p>
+      <w:pPr>
+        <w:pStyle w:val="ListBullet"/>
+      </w:pPr>
+      <w:r>
+        <w:t>the conventional policies and classical updating were unsafe in 81–100%;</w:t>
+      </w:r>
+    </w:p>
+    <w:p>
+      <w:pPr>
+        <w:pStyle w:val="ListBullet"/>
+      </w:pPr>
+      <w:r>
+        <w:t>at 12,000 labels, CAB certified the adapted A→B model in every run.</w:t>
+      </w:r>
+    </w:p>
+    <w:p>
+      <w:pPr>
+        <w:jc w:val="both"/>
+      </w:pPr>
+      <w:r>
+        <w:rPr>
+          <w:b/>
+        </w:rPr>
+        <w:t>Imperfect labels.</w:t>
+      </w:r>
+      <w:r>
+        <w:t xml:space="preserve"> The guarantee assumes the hospital's labels are correct. We relaxed this by recording 5%, 10% or 20% of the labelled septic patients as non-septic in the data CAB sees, while still judging safety with the true labels (20 runs each).</w:t>
+      </w:r>
+    </w:p>
+    <w:p>
+      <w:pPr>
+        <w:jc w:val="both"/>
+      </w:pPr>
+      <w:r>
+        <w:t>CAB became more cautious, not less safe:</w:t>
+      </w:r>
+    </w:p>
+    <w:p>
+      <w:pPr>
+        <w:pStyle w:val="ListBullet"/>
+      </w:pPr>
+      <w:r>
+        <w:rPr>
+          <w:b/>
+        </w:rPr>
+        <w:t>Unsafe rate:</w:t>
+      </w:r>
+      <w:r>
+        <w:t xml:space="preserve"> it stayed at 0–5% of runs, the same as with clean labels.</w:t>
+      </w:r>
+    </w:p>
+    <w:p>
+      <w:pPr>
+        <w:pStyle w:val="ListBullet"/>
+      </w:pPr>
+      <w:r>
+        <w:rPr>
+          <w:b/>
+        </w:rPr>
+        <w:t>A→B:</w:t>
+      </w:r>
+      <w:r>
+        <w:t xml:space="preserve"> CAB switched on the adapted model in 65% of runs at 20% noise, against 100% with clean labels.</w:t>
+      </w:r>
+    </w:p>
+    <w:p>
+      <w:pPr>
+        <w:pStyle w:val="ListBullet"/>
+      </w:pPr>
+      <w:r>
+        <w:rPr>
+          <w:b/>
+        </w:rPr>
+        <w:t>B→A:</w:t>
+      </w:r>
+      <w:r>
+        <w:t xml:space="preserve"> CAB blocked in every run at every noise level.</w:t>
+      </w:r>
+    </w:p>
+    <w:p>
+      <w:pPr>
+        <w:jc w:val="both"/>
+      </w:pPr>
+      <w:r>
+        <w:t>The reason is that a missed septic patient leaves the sensitivity test and enters the false-alert test, where it is usually alerted. Both changes make passing harder. Point-estimate recalibration remained unsafe in every run, at every noise level. Over-calling sepsis and errors in the onset time were not studied.</w:t>
+      </w:r>
+    </w:p>
+    <w:p>
+      <w:pPr>
         <w:pStyle w:val="Heading1"/>
       </w:pPr>
       <w:r>
@@ -8385,7 +8898,7 @@
         <w:jc w:val="both"/>
       </w:pPr>
       <w:r>
-        <w:t>The deployment gate (Fig. 10) collects the three things CAB needs and nothing more:</w:t>
+        <w:t>The deployment gate (Fig. 7) collects the three things CAB needs and nothing more:</w:t>
       </w:r>
     </w:p>
     <w:p>
@@ -8397,7 +8910,7 @@
         <w:drawing>
           <wp:inline xmlns:a="http://schemas.openxmlformats.org/drawingml/2006/main" xmlns:pic="http://schemas.openxmlformats.org/drawingml/2006/picture">
             <wp:extent cx="5580000" cy="6103125"/>
-            <wp:docPr id="10" name="Picture 10"/>
+            <wp:docPr id="7" name="Picture 7"/>
             <wp:cNvGraphicFramePr>
               <a:graphicFrameLocks noChangeAspect="1"/>
             </wp:cNvGraphicFramePr>
@@ -8409,7 +8922,7 @@
                     <pic:cNvPicPr/>
                   </pic:nvPicPr>
                   <pic:blipFill>
-                    <a:blip r:embed="rId18"/>
+                    <a:blip r:embed="rId15"/>
                     <a:stretch>
                       <a:fillRect/>
                     </a:stretch>
@@ -8436,7 +8949,7 @@
         <w:rPr>
           <w:b/>
         </w:rPr>
-        <w:t xml:space="preserve">Fig. 10 </w:t>
+        <w:t xml:space="preserve">Fig. 7 </w:t>
       </w:r>
       <w:r>
         <w:t>The deployment gate of the prototype application: the hospital's requirements, its labelled patients and the vendor package (top); the decision, the evidence for each option, cheapest first, and the retrospective simulation check (bottom).</w:t>
@@ -8530,7 +9043,7 @@
         <w:jc w:val="both"/>
       </w:pPr>
       <w:r>
-        <w:t>In Fig. 10, keeping the model fails, because its sensitivity can only be proven to be at least 62.3%. Recalibration proves 80% sensitivity but fails the false-alert test, with an upper bound of 63.2% against a limit of 45.1%. The adapted model passes both tests (80.2% and 37.1%).</w:t>
+        <w:t>In Fig. 7, keeping the model fails, because its sensitivity can only be proven to be at least 62.3%. Recalibration proves 80% sensitivity but fails the false-alert test, with an upper bound of 63.2% against a limit of 45.1%. The adapted model passes both tests (80.2% and 37.1%).</w:t>
       </w:r>
     </w:p>
     <w:p>
@@ -8554,7 +9067,7 @@
         <w:jc w:val="both"/>
       </w:pPr>
       <w:r>
-        <w:t>The ward monitor (Fig. 11) replays held-out ICU patients hour by hour, using whatever the gate switched on. If the gate blocked, it uses modified NEWS2. A header states which alerting system is in use and whether the gate certified it.</w:t>
+        <w:t>The ward monitor (Fig. 8) replays held-out ICU patients hour by hour, using whatever the gate switched on. If the gate blocked, it uses modified NEWS2. A header states which alerting system is in use and whether the gate certified it.</w:t>
       </w:r>
     </w:p>
     <w:p>
@@ -8566,7 +9079,7 @@
         <w:drawing>
           <wp:inline xmlns:a="http://schemas.openxmlformats.org/drawingml/2006/main" xmlns:pic="http://schemas.openxmlformats.org/drawingml/2006/picture">
             <wp:extent cx="5580000" cy="6385895"/>
-            <wp:docPr id="11" name="Picture 11"/>
+            <wp:docPr id="8" name="Picture 8"/>
             <wp:cNvGraphicFramePr>
               <a:graphicFrameLocks noChangeAspect="1"/>
             </wp:cNvGraphicFramePr>
@@ -8578,7 +9091,7 @@
                     <pic:cNvPicPr/>
                   </pic:nvPicPr>
                   <pic:blipFill>
-                    <a:blip r:embed="rId19"/>
+                    <a:blip r:embed="rId16"/>
                     <a:stretch>
                       <a:fillRect/>
                     </a:stretch>
@@ -8605,10 +9118,10 @@
         <w:rPr>
           <w:b/>
         </w:rPr>
-        <w:t xml:space="preserve">Fig. 11 </w:t>
-      </w:r>
-      <w:r>
-        <w:t>The ward monitor, replaying ICU patients at hour 24 with the adapted model certified in Fig. 10: the ward table with each patient's score relative to the threshold, alert status and 24-hour trend, and one patient's risk trajectory against the alert threshold.</w:t>
+        <w:t xml:space="preserve">Fig. 8 </w:t>
+      </w:r>
+      <w:r>
+        <w:t>The ward monitor, replaying ICU patients at hour 24 with the adapted model certified in Fig. 7: the ward table with each patient's score relative to the threshold, alert status and 24-hour trend, and one patient's risk trajectory against the alert threshold.</w:t>
       </w:r>
     </w:p>
     <w:p>
@@ -8904,7 +9417,7 @@
         <w:t>Label accuracy.</w:t>
       </w:r>
       <w:r>
-        <w:t xml:space="preserve"> Labels were assumed correct. In practice, sepsis onset times are uncertain.</w:t>
+        <w:t xml:space="preserve"> The guarantee assumes correct labels. Missed sepsis labels made CAB more cautious, not less safe (Section 4.8), but over-calling and onset-time errors were not studied.</w:t>
       </w:r>
     </w:p>
     <w:p>

</xml_diff>

<commit_message>
Chapter: regulatory context (FDA PCCP, EU AI Act), recent sepsis literature, verified references 20-26; table widths and figure height cap in Word build
Co-Authored-By: Claude Opus 5.5 <noreply@anthropic.com>
</commit_message>
<xml_diff>
--- a/chapter/CAB_Sepsis_Chapter.docx
+++ b/chapter/CAB_Sepsis_Chapter.docx
@@ -431,7 +431,7 @@
         <w:jc w:val="both"/>
       </w:pPr>
       <w:r>
-        <w:t>Machine-learning models trained on electronic health records do better at the hospital where they are built. The 2019 PhysioNet/Computing in Cardiology Challenge [10] made data from two hospitals openly available so that algorithms could be compared on the same footing. Its organisers deliberately held out a third hospital, and reported that performance fell there. Prospective deployment studies show that well-run sepsis alert systems can help [12]. External evaluations show that the same promise does not carry over automatically to new sites [4].</w:t>
+        <w:t>Machine-learning models trained on electronic health records do better at the hospital where they are built. The 2019 PhysioNet/Computing in Cardiology Challenge [10] made data from two hospitals openly available so that algorithms could be compared on the same footing. Its organisers deliberately held out a third hospital, and reported that performance fell there. Prospective deployment studies show that well-run sepsis alert systems can help [12]. External evaluations show that the same promise does not carry over automatically to new sites [4]. Newer versions have not removed the problem. A prospective study of an updated commercial sepsis model at four US health systems reported good discrimination overall, but wide differences between institutions, a low positive predictive value and a heavy alert load, and its authors advised every adopting hospital to validate the model locally [20]. Evaluation design also matters: a model looks much better when alerts raised after clinicians have already started sepsis care are counted as successes [21]. In ICU data from three countries, a deep-learning model lost discrimination when moved to another database and regained part of it after fine-tuning on a small share of the new site's patients [22]. None of these studies tells a hospital, before go-live, how likely its chosen configuration is to break its own requirements.</w:t>
       </w:r>
     </w:p>
     <w:p>
@@ -511,7 +511,7 @@
         <w:jc w:val="both"/>
       </w:pPr>
       <w:r>
-        <w:t>Distribution-free predictive inference offers a different kind of guarantee. Risk-controlling prediction sets [9] and Learn-then-Test [8] calibrate a parameter of any black-box model, such as a threshold, so that a chosen risk is controlled with high probability. They need only the assumption that the calibration data are exchangeable with future data.</w:t>
+        <w:t>Distribution-free predictive inference offers a different kind of guarantee. Risk-controlling prediction sets [9] and Learn-then-Test [8] calibrate a parameter of any black-box model, such as a threshold, so that a chosen risk is controlled with high probability. They need only the assumption that the calibration data are exchangeable with future data. Conformal risk control bounds the expected value of a monotone loss instead [23]. CAB needs the stronger, high-probability form, because a hospital decides once and lives with the result.</w:t>
       </w:r>
     </w:p>
     <w:p>
@@ -590,6 +590,30 @@
     </w:p>
     <w:p>
       <w:pPr>
+        <w:pStyle w:val="Heading2"/>
+      </w:pPr>
+      <w:r>
+        <w:t>2.5 Regulatory context</w:t>
+      </w:r>
+    </w:p>
+    <w:p>
+      <w:pPr>
+        <w:jc w:val="both"/>
+      </w:pPr>
+      <w:r>
+        <w:t>Regulators already expect the changes a hospital may need to be planned in advance. In the United States, the Food and Drug Administration's guidance on predetermined change control plans for AI-enabled device software lets a manufacturer obtain authorisation for specified future modifications, together with the methods used to develop, validate and implement them and an assessment of their impact [24]. In the European Union, the Artificial Intelligence Act treats AI that is a safety component of, or is itself, a medical device requiring third-party conformity assessment as high-risk [25]. For such systems, changes pre-determined by the provider at the initial assessment and recorded in the technical documentation do not count as a substantial modification (Article 43(4)), and providers must monitor performance after the system is on the market. A 2026 amendment moved the date from which these obligations apply to devices covered by Annex I to 2 August 2028 [26].</w:t>
+      </w:r>
+    </w:p>
+    <w:p>
+      <w:pPr>
+        <w:jc w:val="both"/>
+      </w:pPr>
+      <w:r>
+        <w:t>Both frameworks therefore reward a change protocol that is written down before deployment and has stated acceptance criteria. CAB is such a protocol at the level of a single hospital: the remedies allowed, the order in which they are tried, the evidence each must meet and the default when none passes are all fixed before any local labels are seen.</w:t>
+      </w:r>
+    </w:p>
+    <w:p>
+      <w:pPr>
         <w:pStyle w:val="Heading1"/>
       </w:pPr>
       <w:r>
@@ -663,6 +687,7 @@
       <w:tblPr>
         <w:tblW w:type="auto" w:w="0"/>
         <w:jc w:val="center"/>
+        <w:tblLayout w:type="fixed"/>
         <w:tblLook w:firstColumn="1" w:firstRow="1" w:lastColumn="0" w:lastRow="0" w:noHBand="0" w:noVBand="1" w:val="04A0"/>
         <w:tblBorders>
           <w:top w:val="single" w:sz="6" w:color="000000"/>
@@ -674,18 +699,18 @@
         </w:tblBorders>
       </w:tblPr>
       <w:tblGrid>
-        <w:gridCol w:w="1296"/>
-        <w:gridCol w:w="1296"/>
-        <w:gridCol w:w="1296"/>
-        <w:gridCol w:w="1296"/>
-        <w:gridCol w:w="1296"/>
-        <w:gridCol w:w="1296"/>
-        <w:gridCol w:w="1296"/>
+        <w:gridCol w:w="1207"/>
+        <w:gridCol w:w="1164"/>
+        <w:gridCol w:w="1065"/>
+        <w:gridCol w:w="1349"/>
+        <w:gridCol w:w="710"/>
+        <w:gridCol w:w="1774"/>
+        <w:gridCol w:w="1803"/>
       </w:tblGrid>
       <w:tr>
         <w:tc>
           <w:tcPr>
-            <w:tcW w:type="dxa" w:w="1296"/>
+            <w:tcW w:type="dxa" w:w="1207"/>
             <w:tcBorders>
               <w:bottom w:val="single" w:sz="4" w:color="000000"/>
             </w:tcBorders>
@@ -705,7 +730,7 @@
         </w:tc>
         <w:tc>
           <w:tcPr>
-            <w:tcW w:type="dxa" w:w="1296"/>
+            <w:tcW w:type="dxa" w:w="1164"/>
             <w:tcBorders>
               <w:bottom w:val="single" w:sz="4" w:color="000000"/>
             </w:tcBorders>
@@ -725,7 +750,7 @@
         </w:tc>
         <w:tc>
           <w:tcPr>
-            <w:tcW w:type="dxa" w:w="1296"/>
+            <w:tcW w:type="dxa" w:w="1065"/>
             <w:tcBorders>
               <w:bottom w:val="single" w:sz="4" w:color="000000"/>
             </w:tcBorders>
@@ -745,7 +770,7 @@
         </w:tc>
         <w:tc>
           <w:tcPr>
-            <w:tcW w:type="dxa" w:w="1296"/>
+            <w:tcW w:type="dxa" w:w="1349"/>
             <w:tcBorders>
               <w:bottom w:val="single" w:sz="4" w:color="000000"/>
             </w:tcBorders>
@@ -765,7 +790,7 @@
         </w:tc>
         <w:tc>
           <w:tcPr>
-            <w:tcW w:type="dxa" w:w="1296"/>
+            <w:tcW w:type="dxa" w:w="710"/>
             <w:tcBorders>
               <w:bottom w:val="single" w:sz="4" w:color="000000"/>
             </w:tcBorders>
@@ -785,7 +810,7 @@
         </w:tc>
         <w:tc>
           <w:tcPr>
-            <w:tcW w:type="dxa" w:w="1296"/>
+            <w:tcW w:type="dxa" w:w="1774"/>
             <w:tcBorders>
               <w:bottom w:val="single" w:sz="4" w:color="000000"/>
             </w:tcBorders>
@@ -805,7 +830,7 @@
         </w:tc>
         <w:tc>
           <w:tcPr>
-            <w:tcW w:type="dxa" w:w="1296"/>
+            <w:tcW w:type="dxa" w:w="1803"/>
             <w:tcBorders>
               <w:bottom w:val="single" w:sz="4" w:color="000000"/>
             </w:tcBorders>
@@ -827,7 +852,7 @@
       <w:tr>
         <w:tc>
           <w:tcPr>
-            <w:tcW w:type="dxa" w:w="1296"/>
+            <w:tcW w:type="dxa" w:w="1207"/>
           </w:tcPr>
           <w:p>
             <w:pPr>
@@ -843,7 +868,7 @@
         </w:tc>
         <w:tc>
           <w:tcPr>
-            <w:tcW w:type="dxa" w:w="1296"/>
+            <w:tcW w:type="dxa" w:w="1164"/>
           </w:tcPr>
           <w:p>
             <w:pPr>
@@ -859,7 +884,7 @@
         </w:tc>
         <w:tc>
           <w:tcPr>
-            <w:tcW w:type="dxa" w:w="1296"/>
+            <w:tcW w:type="dxa" w:w="1065"/>
           </w:tcPr>
           <w:p>
             <w:pPr>
@@ -875,7 +900,7 @@
         </w:tc>
         <w:tc>
           <w:tcPr>
-            <w:tcW w:type="dxa" w:w="1296"/>
+            <w:tcW w:type="dxa" w:w="1349"/>
           </w:tcPr>
           <w:p>
             <w:pPr>
@@ -891,7 +916,7 @@
         </w:tc>
         <w:tc>
           <w:tcPr>
-            <w:tcW w:type="dxa" w:w="1296"/>
+            <w:tcW w:type="dxa" w:w="710"/>
           </w:tcPr>
           <w:p>
             <w:pPr>
@@ -907,7 +932,7 @@
         </w:tc>
         <w:tc>
           <w:tcPr>
-            <w:tcW w:type="dxa" w:w="1296"/>
+            <w:tcW w:type="dxa" w:w="1774"/>
           </w:tcPr>
           <w:p>
             <w:pPr>
@@ -923,7 +948,7 @@
         </w:tc>
         <w:tc>
           <w:tcPr>
-            <w:tcW w:type="dxa" w:w="1296"/>
+            <w:tcW w:type="dxa" w:w="1803"/>
           </w:tcPr>
           <w:p>
             <w:pPr>
@@ -941,7 +966,7 @@
       <w:tr>
         <w:tc>
           <w:tcPr>
-            <w:tcW w:type="dxa" w:w="1296"/>
+            <w:tcW w:type="dxa" w:w="1207"/>
           </w:tcPr>
           <w:p>
             <w:pPr>
@@ -957,7 +982,7 @@
         </w:tc>
         <w:tc>
           <w:tcPr>
-            <w:tcW w:type="dxa" w:w="1296"/>
+            <w:tcW w:type="dxa" w:w="1164"/>
           </w:tcPr>
           <w:p>
             <w:pPr>
@@ -973,7 +998,7 @@
         </w:tc>
         <w:tc>
           <w:tcPr>
-            <w:tcW w:type="dxa" w:w="1296"/>
+            <w:tcW w:type="dxa" w:w="1065"/>
           </w:tcPr>
           <w:p>
             <w:pPr>
@@ -989,7 +1014,7 @@
         </w:tc>
         <w:tc>
           <w:tcPr>
-            <w:tcW w:type="dxa" w:w="1296"/>
+            <w:tcW w:type="dxa" w:w="1349"/>
           </w:tcPr>
           <w:p>
             <w:pPr>
@@ -1005,7 +1030,7 @@
         </w:tc>
         <w:tc>
           <w:tcPr>
-            <w:tcW w:type="dxa" w:w="1296"/>
+            <w:tcW w:type="dxa" w:w="710"/>
           </w:tcPr>
           <w:p>
             <w:pPr>
@@ -1021,7 +1046,7 @@
         </w:tc>
         <w:tc>
           <w:tcPr>
-            <w:tcW w:type="dxa" w:w="1296"/>
+            <w:tcW w:type="dxa" w:w="1774"/>
           </w:tcPr>
           <w:p>
             <w:pPr>
@@ -1037,7 +1062,7 @@
         </w:tc>
         <w:tc>
           <w:tcPr>
-            <w:tcW w:type="dxa" w:w="1296"/>
+            <w:tcW w:type="dxa" w:w="1803"/>
           </w:tcPr>
           <w:p>
             <w:pPr>
@@ -1891,6 +1916,7 @@
       <w:tblPr>
         <w:tblW w:type="auto" w:w="0"/>
         <w:jc w:val="center"/>
+        <w:tblLayout w:type="fixed"/>
         <w:tblLook w:firstColumn="1" w:firstRow="1" w:lastColumn="0" w:lastRow="0" w:noHBand="0" w:noVBand="1" w:val="04A0"/>
         <w:tblBorders>
           <w:top w:val="single" w:sz="6" w:color="000000"/>
@@ -1902,20 +1928,20 @@
         </w:tblBorders>
       </w:tblPr>
       <w:tblGrid>
-        <w:gridCol w:w="1008"/>
-        <w:gridCol w:w="1008"/>
-        <w:gridCol w:w="1008"/>
-        <w:gridCol w:w="1008"/>
-        <w:gridCol w:w="1008"/>
-        <w:gridCol w:w="1008"/>
-        <w:gridCol w:w="1008"/>
-        <w:gridCol w:w="1008"/>
-        <w:gridCol w:w="1008"/>
+        <w:gridCol w:w="830"/>
+        <w:gridCol w:w="889"/>
+        <w:gridCol w:w="1240"/>
+        <w:gridCol w:w="830"/>
+        <w:gridCol w:w="1318"/>
+        <w:gridCol w:w="1152"/>
+        <w:gridCol w:w="1562"/>
+        <w:gridCol w:w="537"/>
+        <w:gridCol w:w="713"/>
       </w:tblGrid>
       <w:tr>
         <w:tc>
           <w:tcPr>
-            <w:tcW w:type="dxa" w:w="1008"/>
+            <w:tcW w:type="dxa" w:w="830"/>
             <w:tcBorders>
               <w:bottom w:val="single" w:sz="4" w:color="000000"/>
             </w:tcBorders>
@@ -1935,7 +1961,7 @@
         </w:tc>
         <w:tc>
           <w:tcPr>
-            <w:tcW w:type="dxa" w:w="1008"/>
+            <w:tcW w:type="dxa" w:w="889"/>
             <w:tcBorders>
               <w:bottom w:val="single" w:sz="4" w:color="000000"/>
             </w:tcBorders>
@@ -1955,7 +1981,7 @@
         </w:tc>
         <w:tc>
           <w:tcPr>
-            <w:tcW w:type="dxa" w:w="1008"/>
+            <w:tcW w:type="dxa" w:w="1240"/>
             <w:tcBorders>
               <w:bottom w:val="single" w:sz="4" w:color="000000"/>
             </w:tcBorders>
@@ -1975,7 +2001,7 @@
         </w:tc>
         <w:tc>
           <w:tcPr>
-            <w:tcW w:type="dxa" w:w="1008"/>
+            <w:tcW w:type="dxa" w:w="830"/>
             <w:tcBorders>
               <w:bottom w:val="single" w:sz="4" w:color="000000"/>
             </w:tcBorders>
@@ -1995,7 +2021,7 @@
         </w:tc>
         <w:tc>
           <w:tcPr>
-            <w:tcW w:type="dxa" w:w="1008"/>
+            <w:tcW w:type="dxa" w:w="1318"/>
             <w:tcBorders>
               <w:bottom w:val="single" w:sz="4" w:color="000000"/>
             </w:tcBorders>
@@ -2015,7 +2041,7 @@
         </w:tc>
         <w:tc>
           <w:tcPr>
-            <w:tcW w:type="dxa" w:w="1008"/>
+            <w:tcW w:type="dxa" w:w="1152"/>
             <w:tcBorders>
               <w:bottom w:val="single" w:sz="4" w:color="000000"/>
             </w:tcBorders>
@@ -2035,7 +2061,7 @@
         </w:tc>
         <w:tc>
           <w:tcPr>
-            <w:tcW w:type="dxa" w:w="1008"/>
+            <w:tcW w:type="dxa" w:w="1562"/>
             <w:tcBorders>
               <w:bottom w:val="single" w:sz="4" w:color="000000"/>
             </w:tcBorders>
@@ -2055,7 +2081,7 @@
         </w:tc>
         <w:tc>
           <w:tcPr>
-            <w:tcW w:type="dxa" w:w="1008"/>
+            <w:tcW w:type="dxa" w:w="537"/>
             <w:tcBorders>
               <w:bottom w:val="single" w:sz="4" w:color="000000"/>
             </w:tcBorders>
@@ -2075,7 +2101,7 @@
         </w:tc>
         <w:tc>
           <w:tcPr>
-            <w:tcW w:type="dxa" w:w="1008"/>
+            <w:tcW w:type="dxa" w:w="713"/>
             <w:tcBorders>
               <w:bottom w:val="single" w:sz="4" w:color="000000"/>
             </w:tcBorders>
@@ -2097,7 +2123,7 @@
       <w:tr>
         <w:tc>
           <w:tcPr>
-            <w:tcW w:type="dxa" w:w="1008"/>
+            <w:tcW w:type="dxa" w:w="830"/>
           </w:tcPr>
           <w:p>
             <w:pPr>
@@ -2113,7 +2139,7 @@
         </w:tc>
         <w:tc>
           <w:tcPr>
-            <w:tcW w:type="dxa" w:w="1008"/>
+            <w:tcW w:type="dxa" w:w="889"/>
           </w:tcPr>
           <w:p>
             <w:pPr>
@@ -2129,7 +2155,7 @@
         </w:tc>
         <w:tc>
           <w:tcPr>
-            <w:tcW w:type="dxa" w:w="1008"/>
+            <w:tcW w:type="dxa" w:w="1240"/>
           </w:tcPr>
           <w:p>
             <w:pPr>
@@ -2145,7 +2171,7 @@
         </w:tc>
         <w:tc>
           <w:tcPr>
-            <w:tcW w:type="dxa" w:w="1008"/>
+            <w:tcW w:type="dxa" w:w="830"/>
           </w:tcPr>
           <w:p>
             <w:pPr>
@@ -2161,7 +2187,7 @@
         </w:tc>
         <w:tc>
           <w:tcPr>
-            <w:tcW w:type="dxa" w:w="1008"/>
+            <w:tcW w:type="dxa" w:w="1318"/>
           </w:tcPr>
           <w:p>
             <w:pPr>
@@ -2177,7 +2203,7 @@
         </w:tc>
         <w:tc>
           <w:tcPr>
-            <w:tcW w:type="dxa" w:w="1008"/>
+            <w:tcW w:type="dxa" w:w="1152"/>
           </w:tcPr>
           <w:p>
             <w:pPr>
@@ -2193,7 +2219,7 @@
         </w:tc>
         <w:tc>
           <w:tcPr>
-            <w:tcW w:type="dxa" w:w="1008"/>
+            <w:tcW w:type="dxa" w:w="1562"/>
           </w:tcPr>
           <w:p>
             <w:pPr>
@@ -2209,7 +2235,7 @@
         </w:tc>
         <w:tc>
           <w:tcPr>
-            <w:tcW w:type="dxa" w:w="1008"/>
+            <w:tcW w:type="dxa" w:w="537"/>
           </w:tcPr>
           <w:p>
             <w:pPr>
@@ -2225,7 +2251,7 @@
         </w:tc>
         <w:tc>
           <w:tcPr>
-            <w:tcW w:type="dxa" w:w="1008"/>
+            <w:tcW w:type="dxa" w:w="713"/>
           </w:tcPr>
           <w:p>
             <w:pPr>
@@ -2243,7 +2269,7 @@
       <w:tr>
         <w:tc>
           <w:tcPr>
-            <w:tcW w:type="dxa" w:w="1008"/>
+            <w:tcW w:type="dxa" w:w="830"/>
           </w:tcPr>
           <w:p>
             <w:pPr>
@@ -2253,7 +2279,7 @@
         </w:tc>
         <w:tc>
           <w:tcPr>
-            <w:tcW w:type="dxa" w:w="1008"/>
+            <w:tcW w:type="dxa" w:w="889"/>
           </w:tcPr>
           <w:p>
             <w:pPr>
@@ -2269,7 +2295,7 @@
         </w:tc>
         <w:tc>
           <w:tcPr>
-            <w:tcW w:type="dxa" w:w="1008"/>
+            <w:tcW w:type="dxa" w:w="1240"/>
           </w:tcPr>
           <w:p>
             <w:pPr>
@@ -2285,7 +2311,7 @@
         </w:tc>
         <w:tc>
           <w:tcPr>
-            <w:tcW w:type="dxa" w:w="1008"/>
+            <w:tcW w:type="dxa" w:w="830"/>
           </w:tcPr>
           <w:p>
             <w:pPr>
@@ -2301,7 +2327,7 @@
         </w:tc>
         <w:tc>
           <w:tcPr>
-            <w:tcW w:type="dxa" w:w="1008"/>
+            <w:tcW w:type="dxa" w:w="1318"/>
           </w:tcPr>
           <w:p>
             <w:pPr>
@@ -2317,7 +2343,7 @@
         </w:tc>
         <w:tc>
           <w:tcPr>
-            <w:tcW w:type="dxa" w:w="1008"/>
+            <w:tcW w:type="dxa" w:w="1152"/>
           </w:tcPr>
           <w:p>
             <w:pPr>
@@ -2333,7 +2359,7 @@
         </w:tc>
         <w:tc>
           <w:tcPr>
-            <w:tcW w:type="dxa" w:w="1008"/>
+            <w:tcW w:type="dxa" w:w="1562"/>
           </w:tcPr>
           <w:p>
             <w:pPr>
@@ -2349,7 +2375,7 @@
         </w:tc>
         <w:tc>
           <w:tcPr>
-            <w:tcW w:type="dxa" w:w="1008"/>
+            <w:tcW w:type="dxa" w:w="537"/>
           </w:tcPr>
           <w:p>
             <w:pPr>
@@ -2365,7 +2391,7 @@
         </w:tc>
         <w:tc>
           <w:tcPr>
-            <w:tcW w:type="dxa" w:w="1008"/>
+            <w:tcW w:type="dxa" w:w="713"/>
           </w:tcPr>
           <w:p>
             <w:pPr>
@@ -2383,7 +2409,7 @@
       <w:tr>
         <w:tc>
           <w:tcPr>
-            <w:tcW w:type="dxa" w:w="1008"/>
+            <w:tcW w:type="dxa" w:w="830"/>
           </w:tcPr>
           <w:p>
             <w:pPr>
@@ -2393,7 +2419,7 @@
         </w:tc>
         <w:tc>
           <w:tcPr>
-            <w:tcW w:type="dxa" w:w="1008"/>
+            <w:tcW w:type="dxa" w:w="889"/>
           </w:tcPr>
           <w:p>
             <w:pPr>
@@ -2409,7 +2435,7 @@
         </w:tc>
         <w:tc>
           <w:tcPr>
-            <w:tcW w:type="dxa" w:w="1008"/>
+            <w:tcW w:type="dxa" w:w="1240"/>
           </w:tcPr>
           <w:p>
             <w:pPr>
@@ -2425,7 +2451,7 @@
         </w:tc>
         <w:tc>
           <w:tcPr>
-            <w:tcW w:type="dxa" w:w="1008"/>
+            <w:tcW w:type="dxa" w:w="830"/>
           </w:tcPr>
           <w:p>
             <w:pPr>
@@ -2441,7 +2467,7 @@
         </w:tc>
         <w:tc>
           <w:tcPr>
-            <w:tcW w:type="dxa" w:w="1008"/>
+            <w:tcW w:type="dxa" w:w="1318"/>
           </w:tcPr>
           <w:p>
             <w:pPr>
@@ -2457,7 +2483,7 @@
         </w:tc>
         <w:tc>
           <w:tcPr>
-            <w:tcW w:type="dxa" w:w="1008"/>
+            <w:tcW w:type="dxa" w:w="1152"/>
           </w:tcPr>
           <w:p>
             <w:pPr>
@@ -2473,7 +2499,7 @@
         </w:tc>
         <w:tc>
           <w:tcPr>
-            <w:tcW w:type="dxa" w:w="1008"/>
+            <w:tcW w:type="dxa" w:w="1562"/>
           </w:tcPr>
           <w:p>
             <w:pPr>
@@ -2489,7 +2515,7 @@
         </w:tc>
         <w:tc>
           <w:tcPr>
-            <w:tcW w:type="dxa" w:w="1008"/>
+            <w:tcW w:type="dxa" w:w="537"/>
           </w:tcPr>
           <w:p>
             <w:pPr>
@@ -2505,7 +2531,7 @@
         </w:tc>
         <w:tc>
           <w:tcPr>
-            <w:tcW w:type="dxa" w:w="1008"/>
+            <w:tcW w:type="dxa" w:w="713"/>
           </w:tcPr>
           <w:p>
             <w:pPr>
@@ -2524,7 +2550,7 @@
       <w:tr>
         <w:tc>
           <w:tcPr>
-            <w:tcW w:type="dxa" w:w="1008"/>
+            <w:tcW w:type="dxa" w:w="830"/>
           </w:tcPr>
           <w:p>
             <w:pPr>
@@ -2540,7 +2566,7 @@
         </w:tc>
         <w:tc>
           <w:tcPr>
-            <w:tcW w:type="dxa" w:w="1008"/>
+            <w:tcW w:type="dxa" w:w="889"/>
           </w:tcPr>
           <w:p>
             <w:pPr>
@@ -2556,7 +2582,7 @@
         </w:tc>
         <w:tc>
           <w:tcPr>
-            <w:tcW w:type="dxa" w:w="1008"/>
+            <w:tcW w:type="dxa" w:w="1240"/>
           </w:tcPr>
           <w:p>
             <w:pPr>
@@ -2572,7 +2598,7 @@
         </w:tc>
         <w:tc>
           <w:tcPr>
-            <w:tcW w:type="dxa" w:w="1008"/>
+            <w:tcW w:type="dxa" w:w="830"/>
           </w:tcPr>
           <w:p>
             <w:pPr>
@@ -2588,7 +2614,7 @@
         </w:tc>
         <w:tc>
           <w:tcPr>
-            <w:tcW w:type="dxa" w:w="1008"/>
+            <w:tcW w:type="dxa" w:w="1318"/>
           </w:tcPr>
           <w:p>
             <w:pPr>
@@ -2604,7 +2630,7 @@
         </w:tc>
         <w:tc>
           <w:tcPr>
-            <w:tcW w:type="dxa" w:w="1008"/>
+            <w:tcW w:type="dxa" w:w="1152"/>
           </w:tcPr>
           <w:p>
             <w:pPr>
@@ -2620,7 +2646,7 @@
         </w:tc>
         <w:tc>
           <w:tcPr>
-            <w:tcW w:type="dxa" w:w="1008"/>
+            <w:tcW w:type="dxa" w:w="1562"/>
           </w:tcPr>
           <w:p>
             <w:pPr>
@@ -2636,7 +2662,7 @@
         </w:tc>
         <w:tc>
           <w:tcPr>
-            <w:tcW w:type="dxa" w:w="1008"/>
+            <w:tcW w:type="dxa" w:w="537"/>
           </w:tcPr>
           <w:p>
             <w:pPr>
@@ -2652,7 +2678,7 @@
         </w:tc>
         <w:tc>
           <w:tcPr>
-            <w:tcW w:type="dxa" w:w="1008"/>
+            <w:tcW w:type="dxa" w:w="713"/>
           </w:tcPr>
           <w:p>
             <w:pPr>
@@ -2670,7 +2696,7 @@
       <w:tr>
         <w:tc>
           <w:tcPr>
-            <w:tcW w:type="dxa" w:w="1008"/>
+            <w:tcW w:type="dxa" w:w="830"/>
           </w:tcPr>
           <w:p>
             <w:pPr>
@@ -2680,7 +2706,7 @@
         </w:tc>
         <w:tc>
           <w:tcPr>
-            <w:tcW w:type="dxa" w:w="1008"/>
+            <w:tcW w:type="dxa" w:w="889"/>
           </w:tcPr>
           <w:p>
             <w:pPr>
@@ -2696,7 +2722,7 @@
         </w:tc>
         <w:tc>
           <w:tcPr>
-            <w:tcW w:type="dxa" w:w="1008"/>
+            <w:tcW w:type="dxa" w:w="1240"/>
           </w:tcPr>
           <w:p>
             <w:pPr>
@@ -2712,7 +2738,7 @@
         </w:tc>
         <w:tc>
           <w:tcPr>
-            <w:tcW w:type="dxa" w:w="1008"/>
+            <w:tcW w:type="dxa" w:w="830"/>
           </w:tcPr>
           <w:p>
             <w:pPr>
@@ -2728,7 +2754,7 @@
         </w:tc>
         <w:tc>
           <w:tcPr>
-            <w:tcW w:type="dxa" w:w="1008"/>
+            <w:tcW w:type="dxa" w:w="1318"/>
           </w:tcPr>
           <w:p>
             <w:pPr>
@@ -2744,7 +2770,7 @@
         </w:tc>
         <w:tc>
           <w:tcPr>
-            <w:tcW w:type="dxa" w:w="1008"/>
+            <w:tcW w:type="dxa" w:w="1152"/>
           </w:tcPr>
           <w:p>
             <w:pPr>
@@ -2760,7 +2786,7 @@
         </w:tc>
         <w:tc>
           <w:tcPr>
-            <w:tcW w:type="dxa" w:w="1008"/>
+            <w:tcW w:type="dxa" w:w="1562"/>
           </w:tcPr>
           <w:p>
             <w:pPr>
@@ -2776,7 +2802,7 @@
         </w:tc>
         <w:tc>
           <w:tcPr>
-            <w:tcW w:type="dxa" w:w="1008"/>
+            <w:tcW w:type="dxa" w:w="537"/>
           </w:tcPr>
           <w:p>
             <w:pPr>
@@ -2792,7 +2818,7 @@
         </w:tc>
         <w:tc>
           <w:tcPr>
-            <w:tcW w:type="dxa" w:w="1008"/>
+            <w:tcW w:type="dxa" w:w="713"/>
           </w:tcPr>
           <w:p>
             <w:pPr>
@@ -2810,7 +2836,7 @@
       <w:tr>
         <w:tc>
           <w:tcPr>
-            <w:tcW w:type="dxa" w:w="1008"/>
+            <w:tcW w:type="dxa" w:w="830"/>
           </w:tcPr>
           <w:p>
             <w:pPr>
@@ -2820,7 +2846,7 @@
         </w:tc>
         <w:tc>
           <w:tcPr>
-            <w:tcW w:type="dxa" w:w="1008"/>
+            <w:tcW w:type="dxa" w:w="889"/>
           </w:tcPr>
           <w:p>
             <w:pPr>
@@ -2836,7 +2862,7 @@
         </w:tc>
         <w:tc>
           <w:tcPr>
-            <w:tcW w:type="dxa" w:w="1008"/>
+            <w:tcW w:type="dxa" w:w="1240"/>
           </w:tcPr>
           <w:p>
             <w:pPr>
@@ -2852,7 +2878,7 @@
         </w:tc>
         <w:tc>
           <w:tcPr>
-            <w:tcW w:type="dxa" w:w="1008"/>
+            <w:tcW w:type="dxa" w:w="830"/>
           </w:tcPr>
           <w:p>
             <w:pPr>
@@ -2868,7 +2894,7 @@
         </w:tc>
         <w:tc>
           <w:tcPr>
-            <w:tcW w:type="dxa" w:w="1008"/>
+            <w:tcW w:type="dxa" w:w="1318"/>
           </w:tcPr>
           <w:p>
             <w:pPr>
@@ -2884,7 +2910,7 @@
         </w:tc>
         <w:tc>
           <w:tcPr>
-            <w:tcW w:type="dxa" w:w="1008"/>
+            <w:tcW w:type="dxa" w:w="1152"/>
           </w:tcPr>
           <w:p>
             <w:pPr>
@@ -2900,7 +2926,7 @@
         </w:tc>
         <w:tc>
           <w:tcPr>
-            <w:tcW w:type="dxa" w:w="1008"/>
+            <w:tcW w:type="dxa" w:w="1562"/>
           </w:tcPr>
           <w:p>
             <w:pPr>
@@ -2916,7 +2942,7 @@
         </w:tc>
         <w:tc>
           <w:tcPr>
-            <w:tcW w:type="dxa" w:w="1008"/>
+            <w:tcW w:type="dxa" w:w="537"/>
           </w:tcPr>
           <w:p>
             <w:pPr>
@@ -2932,7 +2958,7 @@
         </w:tc>
         <w:tc>
           <w:tcPr>
-            <w:tcW w:type="dxa" w:w="1008"/>
+            <w:tcW w:type="dxa" w:w="713"/>
           </w:tcPr>
           <w:p>
             <w:pPr>
@@ -2950,7 +2976,7 @@
       <w:tr>
         <w:tc>
           <w:tcPr>
-            <w:tcW w:type="dxa" w:w="1008"/>
+            <w:tcW w:type="dxa" w:w="830"/>
           </w:tcPr>
           <w:p>
             <w:pPr>
@@ -2966,7 +2992,7 @@
         </w:tc>
         <w:tc>
           <w:tcPr>
-            <w:tcW w:type="dxa" w:w="1008"/>
+            <w:tcW w:type="dxa" w:w="889"/>
           </w:tcPr>
           <w:p>
             <w:pPr>
@@ -2982,7 +3008,7 @@
         </w:tc>
         <w:tc>
           <w:tcPr>
-            <w:tcW w:type="dxa" w:w="1008"/>
+            <w:tcW w:type="dxa" w:w="1240"/>
           </w:tcPr>
           <w:p>
             <w:pPr>
@@ -2998,7 +3024,7 @@
         </w:tc>
         <w:tc>
           <w:tcPr>
-            <w:tcW w:type="dxa" w:w="1008"/>
+            <w:tcW w:type="dxa" w:w="830"/>
           </w:tcPr>
           <w:p>
             <w:pPr>
@@ -3014,7 +3040,7 @@
         </w:tc>
         <w:tc>
           <w:tcPr>
-            <w:tcW w:type="dxa" w:w="1008"/>
+            <w:tcW w:type="dxa" w:w="1318"/>
           </w:tcPr>
           <w:p>
             <w:pPr>
@@ -3030,7 +3056,7 @@
         </w:tc>
         <w:tc>
           <w:tcPr>
-            <w:tcW w:type="dxa" w:w="1008"/>
+            <w:tcW w:type="dxa" w:w="1152"/>
           </w:tcPr>
           <w:p>
             <w:pPr>
@@ -3046,7 +3072,7 @@
         </w:tc>
         <w:tc>
           <w:tcPr>
-            <w:tcW w:type="dxa" w:w="1008"/>
+            <w:tcW w:type="dxa" w:w="1562"/>
           </w:tcPr>
           <w:p>
             <w:pPr>
@@ -3062,7 +3088,7 @@
         </w:tc>
         <w:tc>
           <w:tcPr>
-            <w:tcW w:type="dxa" w:w="1008"/>
+            <w:tcW w:type="dxa" w:w="537"/>
           </w:tcPr>
           <w:p>
             <w:pPr>
@@ -3078,7 +3104,7 @@
         </w:tc>
         <w:tc>
           <w:tcPr>
-            <w:tcW w:type="dxa" w:w="1008"/>
+            <w:tcW w:type="dxa" w:w="713"/>
           </w:tcPr>
           <w:p>
             <w:pPr>
@@ -3096,7 +3122,7 @@
       <w:tr>
         <w:tc>
           <w:tcPr>
-            <w:tcW w:type="dxa" w:w="1008"/>
+            <w:tcW w:type="dxa" w:w="830"/>
           </w:tcPr>
           <w:p>
             <w:pPr>
@@ -3106,7 +3132,7 @@
         </w:tc>
         <w:tc>
           <w:tcPr>
-            <w:tcW w:type="dxa" w:w="1008"/>
+            <w:tcW w:type="dxa" w:w="889"/>
           </w:tcPr>
           <w:p>
             <w:pPr>
@@ -3122,7 +3148,7 @@
         </w:tc>
         <w:tc>
           <w:tcPr>
-            <w:tcW w:type="dxa" w:w="1008"/>
+            <w:tcW w:type="dxa" w:w="1240"/>
           </w:tcPr>
           <w:p>
             <w:pPr>
@@ -3138,7 +3164,7 @@
         </w:tc>
         <w:tc>
           <w:tcPr>
-            <w:tcW w:type="dxa" w:w="1008"/>
+            <w:tcW w:type="dxa" w:w="830"/>
           </w:tcPr>
           <w:p>
             <w:pPr>
@@ -3154,7 +3180,7 @@
         </w:tc>
         <w:tc>
           <w:tcPr>
-            <w:tcW w:type="dxa" w:w="1008"/>
+            <w:tcW w:type="dxa" w:w="1318"/>
           </w:tcPr>
           <w:p>
             <w:pPr>
@@ -3170,7 +3196,7 @@
         </w:tc>
         <w:tc>
           <w:tcPr>
-            <w:tcW w:type="dxa" w:w="1008"/>
+            <w:tcW w:type="dxa" w:w="1152"/>
           </w:tcPr>
           <w:p>
             <w:pPr>
@@ -3186,7 +3212,7 @@
         </w:tc>
         <w:tc>
           <w:tcPr>
-            <w:tcW w:type="dxa" w:w="1008"/>
+            <w:tcW w:type="dxa" w:w="1562"/>
           </w:tcPr>
           <w:p>
             <w:pPr>
@@ -3202,7 +3228,7 @@
         </w:tc>
         <w:tc>
           <w:tcPr>
-            <w:tcW w:type="dxa" w:w="1008"/>
+            <w:tcW w:type="dxa" w:w="537"/>
           </w:tcPr>
           <w:p>
             <w:pPr>
@@ -3218,7 +3244,7 @@
         </w:tc>
         <w:tc>
           <w:tcPr>
-            <w:tcW w:type="dxa" w:w="1008"/>
+            <w:tcW w:type="dxa" w:w="713"/>
           </w:tcPr>
           <w:p>
             <w:pPr>
@@ -3236,7 +3262,7 @@
       <w:tr>
         <w:tc>
           <w:tcPr>
-            <w:tcW w:type="dxa" w:w="1008"/>
+            <w:tcW w:type="dxa" w:w="830"/>
           </w:tcPr>
           <w:p>
             <w:pPr>
@@ -3246,7 +3272,7 @@
         </w:tc>
         <w:tc>
           <w:tcPr>
-            <w:tcW w:type="dxa" w:w="1008"/>
+            <w:tcW w:type="dxa" w:w="889"/>
           </w:tcPr>
           <w:p>
             <w:pPr>
@@ -3262,7 +3288,7 @@
         </w:tc>
         <w:tc>
           <w:tcPr>
-            <w:tcW w:type="dxa" w:w="1008"/>
+            <w:tcW w:type="dxa" w:w="1240"/>
           </w:tcPr>
           <w:p>
             <w:pPr>
@@ -3278,7 +3304,7 @@
         </w:tc>
         <w:tc>
           <w:tcPr>
-            <w:tcW w:type="dxa" w:w="1008"/>
+            <w:tcW w:type="dxa" w:w="830"/>
           </w:tcPr>
           <w:p>
             <w:pPr>
@@ -3294,7 +3320,7 @@
         </w:tc>
         <w:tc>
           <w:tcPr>
-            <w:tcW w:type="dxa" w:w="1008"/>
+            <w:tcW w:type="dxa" w:w="1318"/>
           </w:tcPr>
           <w:p>
             <w:pPr>
@@ -3310,7 +3336,7 @@
         </w:tc>
         <w:tc>
           <w:tcPr>
-            <w:tcW w:type="dxa" w:w="1008"/>
+            <w:tcW w:type="dxa" w:w="1152"/>
           </w:tcPr>
           <w:p>
             <w:pPr>
@@ -3326,7 +3352,7 @@
         </w:tc>
         <w:tc>
           <w:tcPr>
-            <w:tcW w:type="dxa" w:w="1008"/>
+            <w:tcW w:type="dxa" w:w="1562"/>
           </w:tcPr>
           <w:p>
             <w:pPr>
@@ -3342,7 +3368,7 @@
         </w:tc>
         <w:tc>
           <w:tcPr>
-            <w:tcW w:type="dxa" w:w="1008"/>
+            <w:tcW w:type="dxa" w:w="537"/>
           </w:tcPr>
           <w:p>
             <w:pPr>
@@ -3358,7 +3384,7 @@
         </w:tc>
         <w:tc>
           <w:tcPr>
-            <w:tcW w:type="dxa" w:w="1008"/>
+            <w:tcW w:type="dxa" w:w="713"/>
           </w:tcPr>
           <w:p>
             <w:pPr>
@@ -3616,6 +3642,7 @@
       <w:tblPr>
         <w:tblW w:type="auto" w:w="0"/>
         <w:jc w:val="center"/>
+        <w:tblLayout w:type="fixed"/>
         <w:tblLook w:firstColumn="1" w:firstRow="1" w:lastColumn="0" w:lastRow="0" w:noHBand="0" w:noVBand="1" w:val="04A0"/>
         <w:tblBorders>
           <w:top w:val="single" w:sz="6" w:color="000000"/>
@@ -3627,14 +3654,14 @@
         </w:tblBorders>
       </w:tblPr>
       <w:tblGrid>
-        <w:gridCol w:w="3024"/>
-        <w:gridCol w:w="3024"/>
-        <w:gridCol w:w="3024"/>
+        <w:gridCol w:w="2391"/>
+        <w:gridCol w:w="1738"/>
+        <w:gridCol w:w="4942"/>
       </w:tblGrid>
       <w:tr>
         <w:tc>
           <w:tcPr>
-            <w:tcW w:type="dxa" w:w="3024"/>
+            <w:tcW w:type="dxa" w:w="2391"/>
             <w:tcBorders>
               <w:bottom w:val="single" w:sz="4" w:color="000000"/>
             </w:tcBorders>
@@ -3654,7 +3681,7 @@
         </w:tc>
         <w:tc>
           <w:tcPr>
-            <w:tcW w:type="dxa" w:w="3024"/>
+            <w:tcW w:type="dxa" w:w="1738"/>
             <w:tcBorders>
               <w:bottom w:val="single" w:sz="4" w:color="000000"/>
             </w:tcBorders>
@@ -3674,7 +3701,7 @@
         </w:tc>
         <w:tc>
           <w:tcPr>
-            <w:tcW w:type="dxa" w:w="3024"/>
+            <w:tcW w:type="dxa" w:w="4942"/>
             <w:tcBorders>
               <w:bottom w:val="single" w:sz="4" w:color="000000"/>
             </w:tcBorders>
@@ -3696,7 +3723,7 @@
       <w:tr>
         <w:tc>
           <w:tcPr>
-            <w:tcW w:type="dxa" w:w="3024"/>
+            <w:tcW w:type="dxa" w:w="2391"/>
           </w:tcPr>
           <w:p>
             <w:pPr>
@@ -3712,7 +3739,7 @@
         </w:tc>
         <w:tc>
           <w:tcPr>
-            <w:tcW w:type="dxa" w:w="3024"/>
+            <w:tcW w:type="dxa" w:w="1738"/>
           </w:tcPr>
           <w:p>
             <w:pPr>
@@ -3728,7 +3755,7 @@
         </w:tc>
         <w:tc>
           <w:tcPr>
-            <w:tcW w:type="dxa" w:w="3024"/>
+            <w:tcW w:type="dxa" w:w="4942"/>
           </w:tcPr>
           <w:p>
             <w:pPr>
@@ -3746,7 +3773,7 @@
       <w:tr>
         <w:tc>
           <w:tcPr>
-            <w:tcW w:type="dxa" w:w="3024"/>
+            <w:tcW w:type="dxa" w:w="2391"/>
           </w:tcPr>
           <w:p>
             <w:pPr>
@@ -3762,7 +3789,7 @@
         </w:tc>
         <w:tc>
           <w:tcPr>
-            <w:tcW w:type="dxa" w:w="3024"/>
+            <w:tcW w:type="dxa" w:w="1738"/>
           </w:tcPr>
           <w:p>
             <w:pPr>
@@ -3778,7 +3805,7 @@
         </w:tc>
         <w:tc>
           <w:tcPr>
-            <w:tcW w:type="dxa" w:w="3024"/>
+            <w:tcW w:type="dxa" w:w="4942"/>
           </w:tcPr>
           <w:p>
             <w:pPr>
@@ -3796,7 +3823,7 @@
       <w:tr>
         <w:tc>
           <w:tcPr>
-            <w:tcW w:type="dxa" w:w="3024"/>
+            <w:tcW w:type="dxa" w:w="2391"/>
           </w:tcPr>
           <w:p>
             <w:pPr>
@@ -3812,7 +3839,7 @@
         </w:tc>
         <w:tc>
           <w:tcPr>
-            <w:tcW w:type="dxa" w:w="3024"/>
+            <w:tcW w:type="dxa" w:w="1738"/>
           </w:tcPr>
           <w:p>
             <w:pPr>
@@ -3828,7 +3855,7 @@
         </w:tc>
         <w:tc>
           <w:tcPr>
-            <w:tcW w:type="dxa" w:w="3024"/>
+            <w:tcW w:type="dxa" w:w="4942"/>
           </w:tcPr>
           <w:p>
             <w:pPr>
@@ -3846,7 +3873,7 @@
       <w:tr>
         <w:tc>
           <w:tcPr>
-            <w:tcW w:type="dxa" w:w="3024"/>
+            <w:tcW w:type="dxa" w:w="2391"/>
           </w:tcPr>
           <w:p>
             <w:pPr>
@@ -3862,7 +3889,7 @@
         </w:tc>
         <w:tc>
           <w:tcPr>
-            <w:tcW w:type="dxa" w:w="3024"/>
+            <w:tcW w:type="dxa" w:w="1738"/>
           </w:tcPr>
           <w:p>
             <w:pPr>
@@ -3878,7 +3905,7 @@
         </w:tc>
         <w:tc>
           <w:tcPr>
-            <w:tcW w:type="dxa" w:w="3024"/>
+            <w:tcW w:type="dxa" w:w="4942"/>
           </w:tcPr>
           <w:p>
             <w:pPr>
@@ -3896,7 +3923,7 @@
       <w:tr>
         <w:tc>
           <w:tcPr>
-            <w:tcW w:type="dxa" w:w="3024"/>
+            <w:tcW w:type="dxa" w:w="2391"/>
           </w:tcPr>
           <w:p>
             <w:pPr>
@@ -3912,7 +3939,7 @@
         </w:tc>
         <w:tc>
           <w:tcPr>
-            <w:tcW w:type="dxa" w:w="3024"/>
+            <w:tcW w:type="dxa" w:w="1738"/>
           </w:tcPr>
           <w:p>
             <w:pPr>
@@ -3928,7 +3955,7 @@
         </w:tc>
         <w:tc>
           <w:tcPr>
-            <w:tcW w:type="dxa" w:w="3024"/>
+            <w:tcW w:type="dxa" w:w="4942"/>
           </w:tcPr>
           <w:p>
             <w:pPr>
@@ -3946,7 +3973,7 @@
       <w:tr>
         <w:tc>
           <w:tcPr>
-            <w:tcW w:type="dxa" w:w="3024"/>
+            <w:tcW w:type="dxa" w:w="2391"/>
           </w:tcPr>
           <w:p>
             <w:pPr>
@@ -3962,7 +3989,7 @@
         </w:tc>
         <w:tc>
           <w:tcPr>
-            <w:tcW w:type="dxa" w:w="3024"/>
+            <w:tcW w:type="dxa" w:w="1738"/>
           </w:tcPr>
           <w:p>
             <w:pPr>
@@ -3978,7 +4005,7 @@
         </w:tc>
         <w:tc>
           <w:tcPr>
-            <w:tcW w:type="dxa" w:w="3024"/>
+            <w:tcW w:type="dxa" w:w="4942"/>
           </w:tcPr>
           <w:p>
             <w:pPr>
@@ -3996,7 +4023,7 @@
       <w:tr>
         <w:tc>
           <w:tcPr>
-            <w:tcW w:type="dxa" w:w="3024"/>
+            <w:tcW w:type="dxa" w:w="2391"/>
           </w:tcPr>
           <w:p>
             <w:pPr>
@@ -4012,7 +4039,7 @@
         </w:tc>
         <w:tc>
           <w:tcPr>
-            <w:tcW w:type="dxa" w:w="3024"/>
+            <w:tcW w:type="dxa" w:w="1738"/>
           </w:tcPr>
           <w:p>
             <w:pPr>
@@ -4028,7 +4055,7 @@
         </w:tc>
         <w:tc>
           <w:tcPr>
-            <w:tcW w:type="dxa" w:w="3024"/>
+            <w:tcW w:type="dxa" w:w="4942"/>
           </w:tcPr>
           <w:p>
             <w:pPr>
@@ -4046,7 +4073,7 @@
       <w:tr>
         <w:tc>
           <w:tcPr>
-            <w:tcW w:type="dxa" w:w="3024"/>
+            <w:tcW w:type="dxa" w:w="2391"/>
           </w:tcPr>
           <w:p>
             <w:pPr>
@@ -4062,7 +4089,7 @@
         </w:tc>
         <w:tc>
           <w:tcPr>
-            <w:tcW w:type="dxa" w:w="3024"/>
+            <w:tcW w:type="dxa" w:w="1738"/>
           </w:tcPr>
           <w:p>
             <w:pPr>
@@ -4078,7 +4105,7 @@
         </w:tc>
         <w:tc>
           <w:tcPr>
-            <w:tcW w:type="dxa" w:w="3024"/>
+            <w:tcW w:type="dxa" w:w="4942"/>
           </w:tcPr>
           <w:p>
             <w:pPr>
@@ -4096,7 +4123,7 @@
       <w:tr>
         <w:tc>
           <w:tcPr>
-            <w:tcW w:type="dxa" w:w="3024"/>
+            <w:tcW w:type="dxa" w:w="2391"/>
           </w:tcPr>
           <w:p>
             <w:pPr>
@@ -4112,7 +4139,7 @@
         </w:tc>
         <w:tc>
           <w:tcPr>
-            <w:tcW w:type="dxa" w:w="3024"/>
+            <w:tcW w:type="dxa" w:w="1738"/>
           </w:tcPr>
           <w:p>
             <w:pPr>
@@ -4128,7 +4155,7 @@
         </w:tc>
         <w:tc>
           <w:tcPr>
-            <w:tcW w:type="dxa" w:w="3024"/>
+            <w:tcW w:type="dxa" w:w="4942"/>
           </w:tcPr>
           <w:p>
             <w:pPr>
@@ -4146,7 +4173,7 @@
       <w:tr>
         <w:tc>
           <w:tcPr>
-            <w:tcW w:type="dxa" w:w="3024"/>
+            <w:tcW w:type="dxa" w:w="2391"/>
           </w:tcPr>
           <w:p>
             <w:pPr>
@@ -4162,7 +4189,7 @@
         </w:tc>
         <w:tc>
           <w:tcPr>
-            <w:tcW w:type="dxa" w:w="3024"/>
+            <w:tcW w:type="dxa" w:w="1738"/>
           </w:tcPr>
           <w:p>
             <w:pPr>
@@ -4178,7 +4205,7 @@
         </w:tc>
         <w:tc>
           <w:tcPr>
-            <w:tcW w:type="dxa" w:w="3024"/>
+            <w:tcW w:type="dxa" w:w="4942"/>
           </w:tcPr>
           <w:p>
             <w:pPr>
@@ -4196,7 +4223,7 @@
       <w:tr>
         <w:tc>
           <w:tcPr>
-            <w:tcW w:type="dxa" w:w="3024"/>
+            <w:tcW w:type="dxa" w:w="2391"/>
           </w:tcPr>
           <w:p>
             <w:pPr>
@@ -4212,7 +4239,7 @@
         </w:tc>
         <w:tc>
           <w:tcPr>
-            <w:tcW w:type="dxa" w:w="3024"/>
+            <w:tcW w:type="dxa" w:w="1738"/>
           </w:tcPr>
           <w:p>
             <w:pPr>
@@ -4228,7 +4255,7 @@
         </w:tc>
         <w:tc>
           <w:tcPr>
-            <w:tcW w:type="dxa" w:w="3024"/>
+            <w:tcW w:type="dxa" w:w="4942"/>
           </w:tcPr>
           <w:p>
             <w:pPr>
@@ -4662,6 +4689,7 @@
       <w:tblPr>
         <w:tblW w:type="auto" w:w="0"/>
         <w:jc w:val="center"/>
+        <w:tblLayout w:type="fixed"/>
         <w:tblLook w:firstColumn="1" w:firstRow="1" w:lastColumn="0" w:lastRow="0" w:noHBand="0" w:noVBand="1" w:val="04A0"/>
         <w:tblBorders>
           <w:top w:val="single" w:sz="6" w:color="000000"/>
@@ -4673,17 +4701,17 @@
         </w:tblBorders>
       </w:tblPr>
       <w:tblGrid>
-        <w:gridCol w:w="1512"/>
-        <w:gridCol w:w="1512"/>
-        <w:gridCol w:w="1512"/>
-        <w:gridCol w:w="1512"/>
-        <w:gridCol w:w="1512"/>
-        <w:gridCol w:w="1512"/>
+        <w:gridCol w:w="1336"/>
+        <w:gridCol w:w="1336"/>
+        <w:gridCol w:w="2280"/>
+        <w:gridCol w:w="865"/>
+        <w:gridCol w:w="1289"/>
+        <w:gridCol w:w="1965"/>
       </w:tblGrid>
       <w:tr>
         <w:tc>
           <w:tcPr>
-            <w:tcW w:type="dxa" w:w="1512"/>
+            <w:tcW w:type="dxa" w:w="1336"/>
             <w:tcBorders>
               <w:bottom w:val="single" w:sz="4" w:color="000000"/>
             </w:tcBorders>
@@ -4703,7 +4731,7 @@
         </w:tc>
         <w:tc>
           <w:tcPr>
-            <w:tcW w:type="dxa" w:w="1512"/>
+            <w:tcW w:type="dxa" w:w="1336"/>
             <w:tcBorders>
               <w:bottom w:val="single" w:sz="4" w:color="000000"/>
             </w:tcBorders>
@@ -4723,7 +4751,7 @@
         </w:tc>
         <w:tc>
           <w:tcPr>
-            <w:tcW w:type="dxa" w:w="1512"/>
+            <w:tcW w:type="dxa" w:w="2280"/>
             <w:tcBorders>
               <w:bottom w:val="single" w:sz="4" w:color="000000"/>
             </w:tcBorders>
@@ -4743,7 +4771,7 @@
         </w:tc>
         <w:tc>
           <w:tcPr>
-            <w:tcW w:type="dxa" w:w="1512"/>
+            <w:tcW w:type="dxa" w:w="865"/>
             <w:tcBorders>
               <w:bottom w:val="single" w:sz="4" w:color="000000"/>
             </w:tcBorders>
@@ -4763,7 +4791,7 @@
         </w:tc>
         <w:tc>
           <w:tcPr>
-            <w:tcW w:type="dxa" w:w="1512"/>
+            <w:tcW w:type="dxa" w:w="1289"/>
             <w:tcBorders>
               <w:bottom w:val="single" w:sz="4" w:color="000000"/>
             </w:tcBorders>
@@ -4783,7 +4811,7 @@
         </w:tc>
         <w:tc>
           <w:tcPr>
-            <w:tcW w:type="dxa" w:w="1512"/>
+            <w:tcW w:type="dxa" w:w="1965"/>
             <w:tcBorders>
               <w:bottom w:val="single" w:sz="4" w:color="000000"/>
             </w:tcBorders>
@@ -4805,7 +4833,7 @@
       <w:tr>
         <w:tc>
           <w:tcPr>
-            <w:tcW w:type="dxa" w:w="1512"/>
+            <w:tcW w:type="dxa" w:w="1336"/>
           </w:tcPr>
           <w:p>
             <w:pPr>
@@ -4821,7 +4849,7 @@
         </w:tc>
         <w:tc>
           <w:tcPr>
-            <w:tcW w:type="dxa" w:w="1512"/>
+            <w:tcW w:type="dxa" w:w="1336"/>
           </w:tcPr>
           <w:p>
             <w:pPr>
@@ -4837,7 +4865,7 @@
         </w:tc>
         <w:tc>
           <w:tcPr>
-            <w:tcW w:type="dxa" w:w="1512"/>
+            <w:tcW w:type="dxa" w:w="2280"/>
           </w:tcPr>
           <w:p>
             <w:pPr>
@@ -4853,7 +4881,7 @@
         </w:tc>
         <w:tc>
           <w:tcPr>
-            <w:tcW w:type="dxa" w:w="1512"/>
+            <w:tcW w:type="dxa" w:w="865"/>
           </w:tcPr>
           <w:p>
             <w:pPr>
@@ -4869,7 +4897,7 @@
         </w:tc>
         <w:tc>
           <w:tcPr>
-            <w:tcW w:type="dxa" w:w="1512"/>
+            <w:tcW w:type="dxa" w:w="1289"/>
           </w:tcPr>
           <w:p>
             <w:pPr>
@@ -4885,7 +4913,7 @@
         </w:tc>
         <w:tc>
           <w:tcPr>
-            <w:tcW w:type="dxa" w:w="1512"/>
+            <w:tcW w:type="dxa" w:w="1965"/>
           </w:tcPr>
           <w:p>
             <w:pPr>
@@ -4903,7 +4931,7 @@
       <w:tr>
         <w:tc>
           <w:tcPr>
-            <w:tcW w:type="dxa" w:w="1512"/>
+            <w:tcW w:type="dxa" w:w="1336"/>
           </w:tcPr>
           <w:p>
             <w:pPr>
@@ -4919,7 +4947,7 @@
         </w:tc>
         <w:tc>
           <w:tcPr>
-            <w:tcW w:type="dxa" w:w="1512"/>
+            <w:tcW w:type="dxa" w:w="1336"/>
           </w:tcPr>
           <w:p>
             <w:pPr>
@@ -4935,7 +4963,7 @@
         </w:tc>
         <w:tc>
           <w:tcPr>
-            <w:tcW w:type="dxa" w:w="1512"/>
+            <w:tcW w:type="dxa" w:w="2280"/>
           </w:tcPr>
           <w:p>
             <w:pPr>
@@ -4951,7 +4979,7 @@
         </w:tc>
         <w:tc>
           <w:tcPr>
-            <w:tcW w:type="dxa" w:w="1512"/>
+            <w:tcW w:type="dxa" w:w="865"/>
           </w:tcPr>
           <w:p>
             <w:pPr>
@@ -4967,7 +4995,7 @@
         </w:tc>
         <w:tc>
           <w:tcPr>
-            <w:tcW w:type="dxa" w:w="1512"/>
+            <w:tcW w:type="dxa" w:w="1289"/>
           </w:tcPr>
           <w:p>
             <w:pPr>
@@ -4983,7 +5011,7 @@
         </w:tc>
         <w:tc>
           <w:tcPr>
-            <w:tcW w:type="dxa" w:w="1512"/>
+            <w:tcW w:type="dxa" w:w="1965"/>
           </w:tcPr>
           <w:p>
             <w:pPr>
@@ -5001,7 +5029,7 @@
       <w:tr>
         <w:tc>
           <w:tcPr>
-            <w:tcW w:type="dxa" w:w="1512"/>
+            <w:tcW w:type="dxa" w:w="1336"/>
           </w:tcPr>
           <w:p>
             <w:pPr>
@@ -5017,7 +5045,7 @@
         </w:tc>
         <w:tc>
           <w:tcPr>
-            <w:tcW w:type="dxa" w:w="1512"/>
+            <w:tcW w:type="dxa" w:w="1336"/>
           </w:tcPr>
           <w:p>
             <w:pPr>
@@ -5033,7 +5061,7 @@
         </w:tc>
         <w:tc>
           <w:tcPr>
-            <w:tcW w:type="dxa" w:w="1512"/>
+            <w:tcW w:type="dxa" w:w="2280"/>
           </w:tcPr>
           <w:p>
             <w:pPr>
@@ -5049,7 +5077,7 @@
         </w:tc>
         <w:tc>
           <w:tcPr>
-            <w:tcW w:type="dxa" w:w="1512"/>
+            <w:tcW w:type="dxa" w:w="865"/>
           </w:tcPr>
           <w:p>
             <w:pPr>
@@ -5065,7 +5093,7 @@
         </w:tc>
         <w:tc>
           <w:tcPr>
-            <w:tcW w:type="dxa" w:w="1512"/>
+            <w:tcW w:type="dxa" w:w="1289"/>
           </w:tcPr>
           <w:p>
             <w:pPr>
@@ -5081,7 +5109,7 @@
         </w:tc>
         <w:tc>
           <w:tcPr>
-            <w:tcW w:type="dxa" w:w="1512"/>
+            <w:tcW w:type="dxa" w:w="1965"/>
           </w:tcPr>
           <w:p>
             <w:pPr>
@@ -5099,7 +5127,7 @@
       <w:tr>
         <w:tc>
           <w:tcPr>
-            <w:tcW w:type="dxa" w:w="1512"/>
+            <w:tcW w:type="dxa" w:w="1336"/>
           </w:tcPr>
           <w:p>
             <w:pPr>
@@ -5115,7 +5143,7 @@
         </w:tc>
         <w:tc>
           <w:tcPr>
-            <w:tcW w:type="dxa" w:w="1512"/>
+            <w:tcW w:type="dxa" w:w="1336"/>
           </w:tcPr>
           <w:p>
             <w:pPr>
@@ -5131,7 +5159,7 @@
         </w:tc>
         <w:tc>
           <w:tcPr>
-            <w:tcW w:type="dxa" w:w="1512"/>
+            <w:tcW w:type="dxa" w:w="2280"/>
           </w:tcPr>
           <w:p>
             <w:pPr>
@@ -5147,7 +5175,7 @@
         </w:tc>
         <w:tc>
           <w:tcPr>
-            <w:tcW w:type="dxa" w:w="1512"/>
+            <w:tcW w:type="dxa" w:w="865"/>
           </w:tcPr>
           <w:p>
             <w:pPr>
@@ -5163,7 +5191,7 @@
         </w:tc>
         <w:tc>
           <w:tcPr>
-            <w:tcW w:type="dxa" w:w="1512"/>
+            <w:tcW w:type="dxa" w:w="1289"/>
           </w:tcPr>
           <w:p>
             <w:pPr>
@@ -5179,7 +5207,7 @@
         </w:tc>
         <w:tc>
           <w:tcPr>
-            <w:tcW w:type="dxa" w:w="1512"/>
+            <w:tcW w:type="dxa" w:w="1965"/>
           </w:tcPr>
           <w:p>
             <w:pPr>
@@ -5197,7 +5225,7 @@
       <w:tr>
         <w:tc>
           <w:tcPr>
-            <w:tcW w:type="dxa" w:w="1512"/>
+            <w:tcW w:type="dxa" w:w="1336"/>
           </w:tcPr>
           <w:p>
             <w:pPr>
@@ -5213,7 +5241,7 @@
         </w:tc>
         <w:tc>
           <w:tcPr>
-            <w:tcW w:type="dxa" w:w="1512"/>
+            <w:tcW w:type="dxa" w:w="1336"/>
           </w:tcPr>
           <w:p>
             <w:pPr>
@@ -5229,7 +5257,7 @@
         </w:tc>
         <w:tc>
           <w:tcPr>
-            <w:tcW w:type="dxa" w:w="1512"/>
+            <w:tcW w:type="dxa" w:w="2280"/>
           </w:tcPr>
           <w:p>
             <w:pPr>
@@ -5245,7 +5273,7 @@
         </w:tc>
         <w:tc>
           <w:tcPr>
-            <w:tcW w:type="dxa" w:w="1512"/>
+            <w:tcW w:type="dxa" w:w="865"/>
           </w:tcPr>
           <w:p>
             <w:pPr>
@@ -5261,7 +5289,7 @@
         </w:tc>
         <w:tc>
           <w:tcPr>
-            <w:tcW w:type="dxa" w:w="1512"/>
+            <w:tcW w:type="dxa" w:w="1289"/>
           </w:tcPr>
           <w:p>
             <w:pPr>
@@ -5277,7 +5305,7 @@
         </w:tc>
         <w:tc>
           <w:tcPr>
-            <w:tcW w:type="dxa" w:w="1512"/>
+            <w:tcW w:type="dxa" w:w="1965"/>
           </w:tcPr>
           <w:p>
             <w:pPr>
@@ -5295,7 +5323,7 @@
       <w:tr>
         <w:tc>
           <w:tcPr>
-            <w:tcW w:type="dxa" w:w="1512"/>
+            <w:tcW w:type="dxa" w:w="1336"/>
           </w:tcPr>
           <w:p>
             <w:pPr>
@@ -5311,7 +5339,7 @@
         </w:tc>
         <w:tc>
           <w:tcPr>
-            <w:tcW w:type="dxa" w:w="1512"/>
+            <w:tcW w:type="dxa" w:w="1336"/>
           </w:tcPr>
           <w:p>
             <w:pPr>
@@ -5327,7 +5355,7 @@
         </w:tc>
         <w:tc>
           <w:tcPr>
-            <w:tcW w:type="dxa" w:w="1512"/>
+            <w:tcW w:type="dxa" w:w="2280"/>
           </w:tcPr>
           <w:p>
             <w:pPr>
@@ -5343,7 +5371,7 @@
         </w:tc>
         <w:tc>
           <w:tcPr>
-            <w:tcW w:type="dxa" w:w="1512"/>
+            <w:tcW w:type="dxa" w:w="865"/>
           </w:tcPr>
           <w:p>
             <w:pPr>
@@ -5359,7 +5387,7 @@
         </w:tc>
         <w:tc>
           <w:tcPr>
-            <w:tcW w:type="dxa" w:w="1512"/>
+            <w:tcW w:type="dxa" w:w="1289"/>
           </w:tcPr>
           <w:p>
             <w:pPr>
@@ -5375,7 +5403,7 @@
         </w:tc>
         <w:tc>
           <w:tcPr>
-            <w:tcW w:type="dxa" w:w="1512"/>
+            <w:tcW w:type="dxa" w:w="1965"/>
           </w:tcPr>
           <w:p>
             <w:pPr>
@@ -5596,6 +5624,7 @@
       <w:tblPr>
         <w:tblW w:type="auto" w:w="0"/>
         <w:jc w:val="center"/>
+        <w:tblLayout w:type="fixed"/>
         <w:tblLook w:firstColumn="1" w:firstRow="1" w:lastColumn="0" w:lastRow="0" w:noHBand="0" w:noVBand="1" w:val="04A0"/>
         <w:tblBorders>
           <w:top w:val="single" w:sz="6" w:color="000000"/>
@@ -5607,14 +5636,14 @@
         </w:tblBorders>
       </w:tblPr>
       <w:tblGrid>
-        <w:gridCol w:w="3024"/>
-        <w:gridCol w:w="3024"/>
-        <w:gridCol w:w="3024"/>
+        <w:gridCol w:w="4304"/>
+        <w:gridCol w:w="2119"/>
+        <w:gridCol w:w="2648"/>
       </w:tblGrid>
       <w:tr>
         <w:tc>
           <w:tcPr>
-            <w:tcW w:type="dxa" w:w="3024"/>
+            <w:tcW w:type="dxa" w:w="4304"/>
             <w:tcBorders>
               <w:bottom w:val="single" w:sz="4" w:color="000000"/>
             </w:tcBorders>
@@ -5634,7 +5663,7 @@
         </w:tc>
         <w:tc>
           <w:tcPr>
-            <w:tcW w:type="dxa" w:w="3024"/>
+            <w:tcW w:type="dxa" w:w="2119"/>
             <w:tcBorders>
               <w:bottom w:val="single" w:sz="4" w:color="000000"/>
             </w:tcBorders>
@@ -5654,7 +5683,7 @@
         </w:tc>
         <w:tc>
           <w:tcPr>
-            <w:tcW w:type="dxa" w:w="3024"/>
+            <w:tcW w:type="dxa" w:w="2648"/>
             <w:tcBorders>
               <w:bottom w:val="single" w:sz="4" w:color="000000"/>
             </w:tcBorders>
@@ -5676,7 +5705,7 @@
       <w:tr>
         <w:tc>
           <w:tcPr>
-            <w:tcW w:type="dxa" w:w="3024"/>
+            <w:tcW w:type="dxa" w:w="4304"/>
           </w:tcPr>
           <w:p>
             <w:pPr>
@@ -5692,7 +5721,7 @@
         </w:tc>
         <w:tc>
           <w:tcPr>
-            <w:tcW w:type="dxa" w:w="3024"/>
+            <w:tcW w:type="dxa" w:w="2119"/>
           </w:tcPr>
           <w:p>
             <w:pPr>
@@ -5708,7 +5737,7 @@
         </w:tc>
         <w:tc>
           <w:tcPr>
-            <w:tcW w:type="dxa" w:w="3024"/>
+            <w:tcW w:type="dxa" w:w="2648"/>
           </w:tcPr>
           <w:p>
             <w:pPr>
@@ -5726,7 +5755,7 @@
       <w:tr>
         <w:tc>
           <w:tcPr>
-            <w:tcW w:type="dxa" w:w="3024"/>
+            <w:tcW w:type="dxa" w:w="4304"/>
           </w:tcPr>
           <w:p>
             <w:pPr>
@@ -5742,7 +5771,7 @@
         </w:tc>
         <w:tc>
           <w:tcPr>
-            <w:tcW w:type="dxa" w:w="3024"/>
+            <w:tcW w:type="dxa" w:w="2119"/>
           </w:tcPr>
           <w:p>
             <w:pPr>
@@ -5758,7 +5787,7 @@
         </w:tc>
         <w:tc>
           <w:tcPr>
-            <w:tcW w:type="dxa" w:w="3024"/>
+            <w:tcW w:type="dxa" w:w="2648"/>
           </w:tcPr>
           <w:p>
             <w:pPr>
@@ -5776,7 +5805,7 @@
       <w:tr>
         <w:tc>
           <w:tcPr>
-            <w:tcW w:type="dxa" w:w="3024"/>
+            <w:tcW w:type="dxa" w:w="4304"/>
           </w:tcPr>
           <w:p>
             <w:pPr>
@@ -5792,7 +5821,7 @@
         </w:tc>
         <w:tc>
           <w:tcPr>
-            <w:tcW w:type="dxa" w:w="3024"/>
+            <w:tcW w:type="dxa" w:w="2119"/>
           </w:tcPr>
           <w:p>
             <w:pPr>
@@ -5808,7 +5837,7 @@
         </w:tc>
         <w:tc>
           <w:tcPr>
-            <w:tcW w:type="dxa" w:w="3024"/>
+            <w:tcW w:type="dxa" w:w="2648"/>
           </w:tcPr>
           <w:p>
             <w:pPr>
@@ -5826,7 +5855,7 @@
       <w:tr>
         <w:tc>
           <w:tcPr>
-            <w:tcW w:type="dxa" w:w="3024"/>
+            <w:tcW w:type="dxa" w:w="4304"/>
           </w:tcPr>
           <w:p>
             <w:pPr>
@@ -5842,7 +5871,7 @@
         </w:tc>
         <w:tc>
           <w:tcPr>
-            <w:tcW w:type="dxa" w:w="3024"/>
+            <w:tcW w:type="dxa" w:w="2119"/>
           </w:tcPr>
           <w:p>
             <w:pPr>
@@ -5858,7 +5887,7 @@
         </w:tc>
         <w:tc>
           <w:tcPr>
-            <w:tcW w:type="dxa" w:w="3024"/>
+            <w:tcW w:type="dxa" w:w="2648"/>
           </w:tcPr>
           <w:p>
             <w:pPr>
@@ -5876,7 +5905,7 @@
       <w:tr>
         <w:tc>
           <w:tcPr>
-            <w:tcW w:type="dxa" w:w="3024"/>
+            <w:tcW w:type="dxa" w:w="4304"/>
           </w:tcPr>
           <w:p>
             <w:pPr>
@@ -5892,7 +5921,7 @@
         </w:tc>
         <w:tc>
           <w:tcPr>
-            <w:tcW w:type="dxa" w:w="3024"/>
+            <w:tcW w:type="dxa" w:w="2119"/>
           </w:tcPr>
           <w:p>
             <w:pPr>
@@ -5908,7 +5937,7 @@
         </w:tc>
         <w:tc>
           <w:tcPr>
-            <w:tcW w:type="dxa" w:w="3024"/>
+            <w:tcW w:type="dxa" w:w="2648"/>
           </w:tcPr>
           <w:p>
             <w:pPr>
@@ -5926,7 +5955,7 @@
       <w:tr>
         <w:tc>
           <w:tcPr>
-            <w:tcW w:type="dxa" w:w="3024"/>
+            <w:tcW w:type="dxa" w:w="4304"/>
           </w:tcPr>
           <w:p>
             <w:pPr>
@@ -5942,7 +5971,7 @@
         </w:tc>
         <w:tc>
           <w:tcPr>
-            <w:tcW w:type="dxa" w:w="3024"/>
+            <w:tcW w:type="dxa" w:w="2119"/>
           </w:tcPr>
           <w:p>
             <w:pPr>
@@ -5958,7 +5987,7 @@
         </w:tc>
         <w:tc>
           <w:tcPr>
-            <w:tcW w:type="dxa" w:w="3024"/>
+            <w:tcW w:type="dxa" w:w="2648"/>
           </w:tcPr>
           <w:p>
             <w:pPr>
@@ -6005,6 +6034,7 @@
       <w:tblPr>
         <w:tblW w:type="auto" w:w="0"/>
         <w:jc w:val="center"/>
+        <w:tblLayout w:type="fixed"/>
         <w:tblLook w:firstColumn="1" w:firstRow="1" w:lastColumn="0" w:lastRow="0" w:noHBand="0" w:noVBand="1" w:val="04A0"/>
         <w:tblBorders>
           <w:top w:val="single" w:sz="6" w:color="000000"/>
@@ -6016,15 +6046,15 @@
         </w:tblBorders>
       </w:tblPr>
       <w:tblGrid>
-        <w:gridCol w:w="2268"/>
-        <w:gridCol w:w="2268"/>
-        <w:gridCol w:w="2268"/>
-        <w:gridCol w:w="2268"/>
+        <w:gridCol w:w="3446"/>
+        <w:gridCol w:w="2078"/>
+        <w:gridCol w:w="1647"/>
+        <w:gridCol w:w="1900"/>
       </w:tblGrid>
       <w:tr>
         <w:tc>
           <w:tcPr>
-            <w:tcW w:type="dxa" w:w="2268"/>
+            <w:tcW w:type="dxa" w:w="3446"/>
             <w:tcBorders>
               <w:bottom w:val="single" w:sz="4" w:color="000000"/>
             </w:tcBorders>
@@ -6044,7 +6074,7 @@
         </w:tc>
         <w:tc>
           <w:tcPr>
-            <w:tcW w:type="dxa" w:w="2268"/>
+            <w:tcW w:type="dxa" w:w="2078"/>
             <w:tcBorders>
               <w:bottom w:val="single" w:sz="4" w:color="000000"/>
             </w:tcBorders>
@@ -6064,7 +6094,7 @@
         </w:tc>
         <w:tc>
           <w:tcPr>
-            <w:tcW w:type="dxa" w:w="2268"/>
+            <w:tcW w:type="dxa" w:w="1647"/>
             <w:tcBorders>
               <w:bottom w:val="single" w:sz="4" w:color="000000"/>
             </w:tcBorders>
@@ -6084,7 +6114,7 @@
         </w:tc>
         <w:tc>
           <w:tcPr>
-            <w:tcW w:type="dxa" w:w="2268"/>
+            <w:tcW w:type="dxa" w:w="1900"/>
             <w:tcBorders>
               <w:bottom w:val="single" w:sz="4" w:color="000000"/>
             </w:tcBorders>
@@ -6106,7 +6136,7 @@
       <w:tr>
         <w:tc>
           <w:tcPr>
-            <w:tcW w:type="dxa" w:w="2268"/>
+            <w:tcW w:type="dxa" w:w="3446"/>
           </w:tcPr>
           <w:p>
             <w:pPr>
@@ -6122,7 +6152,7 @@
         </w:tc>
         <w:tc>
           <w:tcPr>
-            <w:tcW w:type="dxa" w:w="2268"/>
+            <w:tcW w:type="dxa" w:w="2078"/>
           </w:tcPr>
           <w:p>
             <w:pPr>
@@ -6138,7 +6168,7 @@
         </w:tc>
         <w:tc>
           <w:tcPr>
-            <w:tcW w:type="dxa" w:w="2268"/>
+            <w:tcW w:type="dxa" w:w="1647"/>
           </w:tcPr>
           <w:p>
             <w:pPr>
@@ -6154,7 +6184,7 @@
         </w:tc>
         <w:tc>
           <w:tcPr>
-            <w:tcW w:type="dxa" w:w="2268"/>
+            <w:tcW w:type="dxa" w:w="1900"/>
           </w:tcPr>
           <w:p>
             <w:pPr>
@@ -6172,7 +6202,7 @@
       <w:tr>
         <w:tc>
           <w:tcPr>
-            <w:tcW w:type="dxa" w:w="2268"/>
+            <w:tcW w:type="dxa" w:w="3446"/>
           </w:tcPr>
           <w:p>
             <w:pPr>
@@ -6188,7 +6218,7 @@
         </w:tc>
         <w:tc>
           <w:tcPr>
-            <w:tcW w:type="dxa" w:w="2268"/>
+            <w:tcW w:type="dxa" w:w="2078"/>
           </w:tcPr>
           <w:p>
             <w:pPr>
@@ -6204,7 +6234,7 @@
         </w:tc>
         <w:tc>
           <w:tcPr>
-            <w:tcW w:type="dxa" w:w="2268"/>
+            <w:tcW w:type="dxa" w:w="1647"/>
           </w:tcPr>
           <w:p>
             <w:pPr>
@@ -6220,7 +6250,7 @@
         </w:tc>
         <w:tc>
           <w:tcPr>
-            <w:tcW w:type="dxa" w:w="2268"/>
+            <w:tcW w:type="dxa" w:w="1900"/>
           </w:tcPr>
           <w:p>
             <w:pPr>
@@ -6238,7 +6268,7 @@
       <w:tr>
         <w:tc>
           <w:tcPr>
-            <w:tcW w:type="dxa" w:w="2268"/>
+            <w:tcW w:type="dxa" w:w="3446"/>
           </w:tcPr>
           <w:p>
             <w:pPr>
@@ -6254,7 +6284,7 @@
         </w:tc>
         <w:tc>
           <w:tcPr>
-            <w:tcW w:type="dxa" w:w="2268"/>
+            <w:tcW w:type="dxa" w:w="2078"/>
           </w:tcPr>
           <w:p>
             <w:pPr>
@@ -6270,7 +6300,7 @@
         </w:tc>
         <w:tc>
           <w:tcPr>
-            <w:tcW w:type="dxa" w:w="2268"/>
+            <w:tcW w:type="dxa" w:w="1647"/>
           </w:tcPr>
           <w:p>
             <w:pPr>
@@ -6286,7 +6316,7 @@
         </w:tc>
         <w:tc>
           <w:tcPr>
-            <w:tcW w:type="dxa" w:w="2268"/>
+            <w:tcW w:type="dxa" w:w="1900"/>
           </w:tcPr>
           <w:p>
             <w:pPr>
@@ -6568,6 +6598,7 @@
       <w:tblPr>
         <w:tblW w:type="auto" w:w="0"/>
         <w:jc w:val="center"/>
+        <w:tblLayout w:type="fixed"/>
         <w:tblLook w:firstColumn="1" w:firstRow="1" w:lastColumn="0" w:lastRow="0" w:noHBand="0" w:noVBand="1" w:val="04A0"/>
         <w:tblBorders>
           <w:top w:val="single" w:sz="6" w:color="000000"/>
@@ -6579,18 +6610,18 @@
         </w:tblBorders>
       </w:tblPr>
       <w:tblGrid>
-        <w:gridCol w:w="1296"/>
-        <w:gridCol w:w="1296"/>
-        <w:gridCol w:w="1296"/>
-        <w:gridCol w:w="1296"/>
-        <w:gridCol w:w="1296"/>
-        <w:gridCol w:w="1296"/>
-        <w:gridCol w:w="1296"/>
+        <w:gridCol w:w="619"/>
+        <w:gridCol w:w="1830"/>
+        <w:gridCol w:w="1104"/>
+        <w:gridCol w:w="740"/>
+        <w:gridCol w:w="1009"/>
+        <w:gridCol w:w="1615"/>
+        <w:gridCol w:w="2153"/>
       </w:tblGrid>
       <w:tr>
         <w:tc>
           <w:tcPr>
-            <w:tcW w:type="dxa" w:w="1296"/>
+            <w:tcW w:type="dxa" w:w="619"/>
             <w:tcBorders>
               <w:bottom w:val="single" w:sz="4" w:color="000000"/>
             </w:tcBorders>
@@ -6610,7 +6641,7 @@
         </w:tc>
         <w:tc>
           <w:tcPr>
-            <w:tcW w:type="dxa" w:w="1296"/>
+            <w:tcW w:type="dxa" w:w="1830"/>
             <w:tcBorders>
               <w:bottom w:val="single" w:sz="4" w:color="000000"/>
             </w:tcBorders>
@@ -6630,7 +6661,7 @@
         </w:tc>
         <w:tc>
           <w:tcPr>
-            <w:tcW w:type="dxa" w:w="1296"/>
+            <w:tcW w:type="dxa" w:w="1104"/>
             <w:tcBorders>
               <w:bottom w:val="single" w:sz="4" w:color="000000"/>
             </w:tcBorders>
@@ -6650,7 +6681,7 @@
         </w:tc>
         <w:tc>
           <w:tcPr>
-            <w:tcW w:type="dxa" w:w="1296"/>
+            <w:tcW w:type="dxa" w:w="740"/>
             <w:tcBorders>
               <w:bottom w:val="single" w:sz="4" w:color="000000"/>
             </w:tcBorders>
@@ -6670,7 +6701,7 @@
         </w:tc>
         <w:tc>
           <w:tcPr>
-            <w:tcW w:type="dxa" w:w="1296"/>
+            <w:tcW w:type="dxa" w:w="1009"/>
             <w:tcBorders>
               <w:bottom w:val="single" w:sz="4" w:color="000000"/>
             </w:tcBorders>
@@ -6690,7 +6721,7 @@
         </w:tc>
         <w:tc>
           <w:tcPr>
-            <w:tcW w:type="dxa" w:w="1296"/>
+            <w:tcW w:type="dxa" w:w="1615"/>
             <w:tcBorders>
               <w:bottom w:val="single" w:sz="4" w:color="000000"/>
             </w:tcBorders>
@@ -6710,7 +6741,7 @@
         </w:tc>
         <w:tc>
           <w:tcPr>
-            <w:tcW w:type="dxa" w:w="1296"/>
+            <w:tcW w:type="dxa" w:w="2153"/>
             <w:tcBorders>
               <w:bottom w:val="single" w:sz="4" w:color="000000"/>
             </w:tcBorders>
@@ -6732,7 +6763,7 @@
       <w:tr>
         <w:tc>
           <w:tcPr>
-            <w:tcW w:type="dxa" w:w="1296"/>
+            <w:tcW w:type="dxa" w:w="619"/>
           </w:tcPr>
           <w:p>
             <w:pPr>
@@ -6748,7 +6779,7 @@
         </w:tc>
         <w:tc>
           <w:tcPr>
-            <w:tcW w:type="dxa" w:w="1296"/>
+            <w:tcW w:type="dxa" w:w="1830"/>
           </w:tcPr>
           <w:p>
             <w:pPr>
@@ -6764,7 +6795,7 @@
         </w:tc>
         <w:tc>
           <w:tcPr>
-            <w:tcW w:type="dxa" w:w="1296"/>
+            <w:tcW w:type="dxa" w:w="1104"/>
           </w:tcPr>
           <w:p>
             <w:pPr>
@@ -6780,7 +6811,7 @@
         </w:tc>
         <w:tc>
           <w:tcPr>
-            <w:tcW w:type="dxa" w:w="1296"/>
+            <w:tcW w:type="dxa" w:w="740"/>
           </w:tcPr>
           <w:p>
             <w:pPr>
@@ -6796,7 +6827,7 @@
         </w:tc>
         <w:tc>
           <w:tcPr>
-            <w:tcW w:type="dxa" w:w="1296"/>
+            <w:tcW w:type="dxa" w:w="1009"/>
           </w:tcPr>
           <w:p>
             <w:pPr>
@@ -6812,7 +6843,7 @@
         </w:tc>
         <w:tc>
           <w:tcPr>
-            <w:tcW w:type="dxa" w:w="1296"/>
+            <w:tcW w:type="dxa" w:w="1615"/>
           </w:tcPr>
           <w:p>
             <w:pPr>
@@ -6828,7 +6859,7 @@
         </w:tc>
         <w:tc>
           <w:tcPr>
-            <w:tcW w:type="dxa" w:w="1296"/>
+            <w:tcW w:type="dxa" w:w="2153"/>
           </w:tcPr>
           <w:p>
             <w:pPr>
@@ -6846,7 +6877,7 @@
       <w:tr>
         <w:tc>
           <w:tcPr>
-            <w:tcW w:type="dxa" w:w="1296"/>
+            <w:tcW w:type="dxa" w:w="619"/>
           </w:tcPr>
           <w:p>
             <w:pPr>
@@ -6862,7 +6893,7 @@
         </w:tc>
         <w:tc>
           <w:tcPr>
-            <w:tcW w:type="dxa" w:w="1296"/>
+            <w:tcW w:type="dxa" w:w="1830"/>
           </w:tcPr>
           <w:p>
             <w:pPr>
@@ -6878,7 +6909,7 @@
         </w:tc>
         <w:tc>
           <w:tcPr>
-            <w:tcW w:type="dxa" w:w="1296"/>
+            <w:tcW w:type="dxa" w:w="1104"/>
           </w:tcPr>
           <w:p>
             <w:pPr>
@@ -6894,7 +6925,7 @@
         </w:tc>
         <w:tc>
           <w:tcPr>
-            <w:tcW w:type="dxa" w:w="1296"/>
+            <w:tcW w:type="dxa" w:w="740"/>
           </w:tcPr>
           <w:p>
             <w:pPr>
@@ -6910,7 +6941,7 @@
         </w:tc>
         <w:tc>
           <w:tcPr>
-            <w:tcW w:type="dxa" w:w="1296"/>
+            <w:tcW w:type="dxa" w:w="1009"/>
           </w:tcPr>
           <w:p>
             <w:pPr>
@@ -6926,7 +6957,7 @@
         </w:tc>
         <w:tc>
           <w:tcPr>
-            <w:tcW w:type="dxa" w:w="1296"/>
+            <w:tcW w:type="dxa" w:w="1615"/>
           </w:tcPr>
           <w:p>
             <w:pPr>
@@ -6942,7 +6973,7 @@
         </w:tc>
         <w:tc>
           <w:tcPr>
-            <w:tcW w:type="dxa" w:w="1296"/>
+            <w:tcW w:type="dxa" w:w="2153"/>
           </w:tcPr>
           <w:p>
             <w:pPr>
@@ -6960,7 +6991,7 @@
       <w:tr>
         <w:tc>
           <w:tcPr>
-            <w:tcW w:type="dxa" w:w="1296"/>
+            <w:tcW w:type="dxa" w:w="619"/>
           </w:tcPr>
           <w:p>
             <w:pPr>
@@ -6976,7 +7007,7 @@
         </w:tc>
         <w:tc>
           <w:tcPr>
-            <w:tcW w:type="dxa" w:w="1296"/>
+            <w:tcW w:type="dxa" w:w="1830"/>
           </w:tcPr>
           <w:p>
             <w:pPr>
@@ -6992,7 +7023,7 @@
         </w:tc>
         <w:tc>
           <w:tcPr>
-            <w:tcW w:type="dxa" w:w="1296"/>
+            <w:tcW w:type="dxa" w:w="1104"/>
           </w:tcPr>
           <w:p>
             <w:pPr>
@@ -7008,7 +7039,7 @@
         </w:tc>
         <w:tc>
           <w:tcPr>
-            <w:tcW w:type="dxa" w:w="1296"/>
+            <w:tcW w:type="dxa" w:w="740"/>
           </w:tcPr>
           <w:p>
             <w:pPr>
@@ -7024,7 +7055,7 @@
         </w:tc>
         <w:tc>
           <w:tcPr>
-            <w:tcW w:type="dxa" w:w="1296"/>
+            <w:tcW w:type="dxa" w:w="1009"/>
           </w:tcPr>
           <w:p>
             <w:pPr>
@@ -7040,7 +7071,7 @@
         </w:tc>
         <w:tc>
           <w:tcPr>
-            <w:tcW w:type="dxa" w:w="1296"/>
+            <w:tcW w:type="dxa" w:w="1615"/>
           </w:tcPr>
           <w:p>
             <w:pPr>
@@ -7056,7 +7087,7 @@
         </w:tc>
         <w:tc>
           <w:tcPr>
-            <w:tcW w:type="dxa" w:w="1296"/>
+            <w:tcW w:type="dxa" w:w="2153"/>
           </w:tcPr>
           <w:p>
             <w:pPr>
@@ -7074,7 +7105,7 @@
       <w:tr>
         <w:tc>
           <w:tcPr>
-            <w:tcW w:type="dxa" w:w="1296"/>
+            <w:tcW w:type="dxa" w:w="619"/>
           </w:tcPr>
           <w:p>
             <w:pPr>
@@ -7090,7 +7121,7 @@
         </w:tc>
         <w:tc>
           <w:tcPr>
-            <w:tcW w:type="dxa" w:w="1296"/>
+            <w:tcW w:type="dxa" w:w="1830"/>
           </w:tcPr>
           <w:p>
             <w:pPr>
@@ -7106,7 +7137,7 @@
         </w:tc>
         <w:tc>
           <w:tcPr>
-            <w:tcW w:type="dxa" w:w="1296"/>
+            <w:tcW w:type="dxa" w:w="1104"/>
           </w:tcPr>
           <w:p>
             <w:pPr>
@@ -7122,7 +7153,7 @@
         </w:tc>
         <w:tc>
           <w:tcPr>
-            <w:tcW w:type="dxa" w:w="1296"/>
+            <w:tcW w:type="dxa" w:w="740"/>
           </w:tcPr>
           <w:p>
             <w:pPr>
@@ -7138,7 +7169,7 @@
         </w:tc>
         <w:tc>
           <w:tcPr>
-            <w:tcW w:type="dxa" w:w="1296"/>
+            <w:tcW w:type="dxa" w:w="1009"/>
           </w:tcPr>
           <w:p>
             <w:pPr>
@@ -7154,7 +7185,7 @@
         </w:tc>
         <w:tc>
           <w:tcPr>
-            <w:tcW w:type="dxa" w:w="1296"/>
+            <w:tcW w:type="dxa" w:w="1615"/>
           </w:tcPr>
           <w:p>
             <w:pPr>
@@ -7170,7 +7201,7 @@
         </w:tc>
         <w:tc>
           <w:tcPr>
-            <w:tcW w:type="dxa" w:w="1296"/>
+            <w:tcW w:type="dxa" w:w="2153"/>
           </w:tcPr>
           <w:p>
             <w:pPr>
@@ -7188,7 +7219,7 @@
       <w:tr>
         <w:tc>
           <w:tcPr>
-            <w:tcW w:type="dxa" w:w="1296"/>
+            <w:tcW w:type="dxa" w:w="619"/>
           </w:tcPr>
           <w:p>
             <w:pPr>
@@ -7204,7 +7235,7 @@
         </w:tc>
         <w:tc>
           <w:tcPr>
-            <w:tcW w:type="dxa" w:w="1296"/>
+            <w:tcW w:type="dxa" w:w="1830"/>
           </w:tcPr>
           <w:p>
             <w:pPr>
@@ -7220,7 +7251,7 @@
         </w:tc>
         <w:tc>
           <w:tcPr>
-            <w:tcW w:type="dxa" w:w="1296"/>
+            <w:tcW w:type="dxa" w:w="1104"/>
           </w:tcPr>
           <w:p>
             <w:pPr>
@@ -7236,7 +7267,7 @@
         </w:tc>
         <w:tc>
           <w:tcPr>
-            <w:tcW w:type="dxa" w:w="1296"/>
+            <w:tcW w:type="dxa" w:w="740"/>
           </w:tcPr>
           <w:p>
             <w:pPr>
@@ -7252,7 +7283,7 @@
         </w:tc>
         <w:tc>
           <w:tcPr>
-            <w:tcW w:type="dxa" w:w="1296"/>
+            <w:tcW w:type="dxa" w:w="1009"/>
           </w:tcPr>
           <w:p>
             <w:pPr>
@@ -7268,7 +7299,7 @@
         </w:tc>
         <w:tc>
           <w:tcPr>
-            <w:tcW w:type="dxa" w:w="1296"/>
+            <w:tcW w:type="dxa" w:w="1615"/>
           </w:tcPr>
           <w:p>
             <w:pPr>
@@ -7284,7 +7315,7 @@
         </w:tc>
         <w:tc>
           <w:tcPr>
-            <w:tcW w:type="dxa" w:w="1296"/>
+            <w:tcW w:type="dxa" w:w="2153"/>
           </w:tcPr>
           <w:p>
             <w:pPr>
@@ -7302,7 +7333,7 @@
       <w:tr>
         <w:tc>
           <w:tcPr>
-            <w:tcW w:type="dxa" w:w="1296"/>
+            <w:tcW w:type="dxa" w:w="619"/>
           </w:tcPr>
           <w:p>
             <w:pPr>
@@ -7318,7 +7349,7 @@
         </w:tc>
         <w:tc>
           <w:tcPr>
-            <w:tcW w:type="dxa" w:w="1296"/>
+            <w:tcW w:type="dxa" w:w="1830"/>
           </w:tcPr>
           <w:p>
             <w:pPr>
@@ -7334,7 +7365,7 @@
         </w:tc>
         <w:tc>
           <w:tcPr>
-            <w:tcW w:type="dxa" w:w="1296"/>
+            <w:tcW w:type="dxa" w:w="1104"/>
           </w:tcPr>
           <w:p>
             <w:pPr>
@@ -7350,7 +7381,7 @@
         </w:tc>
         <w:tc>
           <w:tcPr>
-            <w:tcW w:type="dxa" w:w="1296"/>
+            <w:tcW w:type="dxa" w:w="740"/>
           </w:tcPr>
           <w:p>
             <w:pPr>
@@ -7366,7 +7397,7 @@
         </w:tc>
         <w:tc>
           <w:tcPr>
-            <w:tcW w:type="dxa" w:w="1296"/>
+            <w:tcW w:type="dxa" w:w="1009"/>
           </w:tcPr>
           <w:p>
             <w:pPr>
@@ -7382,7 +7413,7 @@
         </w:tc>
         <w:tc>
           <w:tcPr>
-            <w:tcW w:type="dxa" w:w="1296"/>
+            <w:tcW w:type="dxa" w:w="1615"/>
           </w:tcPr>
           <w:p>
             <w:pPr>
@@ -7398,7 +7429,7 @@
         </w:tc>
         <w:tc>
           <w:tcPr>
-            <w:tcW w:type="dxa" w:w="1296"/>
+            <w:tcW w:type="dxa" w:w="2153"/>
           </w:tcPr>
           <w:p>
             <w:pPr>
@@ -7416,7 +7447,7 @@
       <w:tr>
         <w:tc>
           <w:tcPr>
-            <w:tcW w:type="dxa" w:w="1296"/>
+            <w:tcW w:type="dxa" w:w="619"/>
           </w:tcPr>
           <w:p>
             <w:pPr>
@@ -7432,7 +7463,7 @@
         </w:tc>
         <w:tc>
           <w:tcPr>
-            <w:tcW w:type="dxa" w:w="1296"/>
+            <w:tcW w:type="dxa" w:w="1830"/>
           </w:tcPr>
           <w:p>
             <w:pPr>
@@ -7448,7 +7479,7 @@
         </w:tc>
         <w:tc>
           <w:tcPr>
-            <w:tcW w:type="dxa" w:w="1296"/>
+            <w:tcW w:type="dxa" w:w="1104"/>
           </w:tcPr>
           <w:p>
             <w:pPr>
@@ -7464,7 +7495,7 @@
         </w:tc>
         <w:tc>
           <w:tcPr>
-            <w:tcW w:type="dxa" w:w="1296"/>
+            <w:tcW w:type="dxa" w:w="740"/>
           </w:tcPr>
           <w:p>
             <w:pPr>
@@ -7480,7 +7511,7 @@
         </w:tc>
         <w:tc>
           <w:tcPr>
-            <w:tcW w:type="dxa" w:w="1296"/>
+            <w:tcW w:type="dxa" w:w="1009"/>
           </w:tcPr>
           <w:p>
             <w:pPr>
@@ -7496,7 +7527,7 @@
         </w:tc>
         <w:tc>
           <w:tcPr>
-            <w:tcW w:type="dxa" w:w="1296"/>
+            <w:tcW w:type="dxa" w:w="1615"/>
           </w:tcPr>
           <w:p>
             <w:pPr>
@@ -7512,7 +7543,7 @@
         </w:tc>
         <w:tc>
           <w:tcPr>
-            <w:tcW w:type="dxa" w:w="1296"/>
+            <w:tcW w:type="dxa" w:w="2153"/>
           </w:tcPr>
           <w:p>
             <w:pPr>
@@ -7649,6 +7680,7 @@
       <w:tblPr>
         <w:tblW w:type="auto" w:w="0"/>
         <w:jc w:val="center"/>
+        <w:tblLayout w:type="fixed"/>
         <w:tblLook w:firstColumn="1" w:firstRow="1" w:lastColumn="0" w:lastRow="0" w:noHBand="0" w:noVBand="1" w:val="04A0"/>
         <w:tblBorders>
           <w:top w:val="single" w:sz="6" w:color="000000"/>
@@ -7660,13 +7692,13 @@
         </w:tblBorders>
       </w:tblPr>
       <w:tblGrid>
-        <w:gridCol w:w="4536"/>
-        <w:gridCol w:w="4536"/>
+        <w:gridCol w:w="5381"/>
+        <w:gridCol w:w="3690"/>
       </w:tblGrid>
       <w:tr>
         <w:tc>
           <w:tcPr>
-            <w:tcW w:type="dxa" w:w="4536"/>
+            <w:tcW w:type="dxa" w:w="5381"/>
             <w:tcBorders>
               <w:bottom w:val="single" w:sz="4" w:color="000000"/>
             </w:tcBorders>
@@ -7686,7 +7718,7 @@
         </w:tc>
         <w:tc>
           <w:tcPr>
-            <w:tcW w:type="dxa" w:w="4536"/>
+            <w:tcW w:type="dxa" w:w="3690"/>
             <w:tcBorders>
               <w:bottom w:val="single" w:sz="4" w:color="000000"/>
             </w:tcBorders>
@@ -7708,7 +7740,7 @@
       <w:tr>
         <w:tc>
           <w:tcPr>
-            <w:tcW w:type="dxa" w:w="4536"/>
+            <w:tcW w:type="dxa" w:w="5381"/>
           </w:tcPr>
           <w:p>
             <w:pPr>
@@ -7724,7 +7756,7 @@
         </w:tc>
         <w:tc>
           <w:tcPr>
-            <w:tcW w:type="dxa" w:w="4536"/>
+            <w:tcW w:type="dxa" w:w="3690"/>
           </w:tcPr>
           <w:p>
             <w:pPr>
@@ -7742,7 +7774,7 @@
       <w:tr>
         <w:tc>
           <w:tcPr>
-            <w:tcW w:type="dxa" w:w="4536"/>
+            <w:tcW w:type="dxa" w:w="5381"/>
           </w:tcPr>
           <w:p>
             <w:pPr>
@@ -7758,7 +7790,7 @@
         </w:tc>
         <w:tc>
           <w:tcPr>
-            <w:tcW w:type="dxa" w:w="4536"/>
+            <w:tcW w:type="dxa" w:w="3690"/>
           </w:tcPr>
           <w:p>
             <w:pPr>
@@ -7776,7 +7808,7 @@
       <w:tr>
         <w:tc>
           <w:tcPr>
-            <w:tcW w:type="dxa" w:w="4536"/>
+            <w:tcW w:type="dxa" w:w="5381"/>
           </w:tcPr>
           <w:p>
             <w:pPr>
@@ -7792,7 +7824,7 @@
         </w:tc>
         <w:tc>
           <w:tcPr>
-            <w:tcW w:type="dxa" w:w="4536"/>
+            <w:tcW w:type="dxa" w:w="3690"/>
           </w:tcPr>
           <w:p>
             <w:pPr>
@@ -8014,6 +8046,7 @@
       <w:tblPr>
         <w:tblW w:type="auto" w:w="0"/>
         <w:jc w:val="center"/>
+        <w:tblLayout w:type="fixed"/>
         <w:tblLook w:firstColumn="1" w:firstRow="1" w:lastColumn="0" w:lastRow="0" w:noHBand="0" w:noVBand="1" w:val="04A0"/>
         <w:tblBorders>
           <w:top w:val="single" w:sz="6" w:color="000000"/>
@@ -8025,13 +8058,13 @@
         </w:tblBorders>
       </w:tblPr>
       <w:tblGrid>
-        <w:gridCol w:w="4536"/>
-        <w:gridCol w:w="4536"/>
+        <w:gridCol w:w="3912"/>
+        <w:gridCol w:w="5159"/>
       </w:tblGrid>
       <w:tr>
         <w:tc>
           <w:tcPr>
-            <w:tcW w:type="dxa" w:w="4536"/>
+            <w:tcW w:type="dxa" w:w="3912"/>
             <w:tcBorders>
               <w:bottom w:val="single" w:sz="4" w:color="000000"/>
             </w:tcBorders>
@@ -8051,7 +8084,7 @@
         </w:tc>
         <w:tc>
           <w:tcPr>
-            <w:tcW w:type="dxa" w:w="4536"/>
+            <w:tcW w:type="dxa" w:w="5159"/>
             <w:tcBorders>
               <w:bottom w:val="single" w:sz="4" w:color="000000"/>
             </w:tcBorders>
@@ -8073,7 +8106,7 @@
       <w:tr>
         <w:tc>
           <w:tcPr>
-            <w:tcW w:type="dxa" w:w="4536"/>
+            <w:tcW w:type="dxa" w:w="3912"/>
           </w:tcPr>
           <w:p>
             <w:pPr>
@@ -8089,7 +8122,7 @@
         </w:tc>
         <w:tc>
           <w:tcPr>
-            <w:tcW w:type="dxa" w:w="4536"/>
+            <w:tcW w:type="dxa" w:w="5159"/>
           </w:tcPr>
           <w:p>
             <w:pPr>
@@ -8107,7 +8140,7 @@
       <w:tr>
         <w:tc>
           <w:tcPr>
-            <w:tcW w:type="dxa" w:w="4536"/>
+            <w:tcW w:type="dxa" w:w="3912"/>
           </w:tcPr>
           <w:p>
             <w:pPr>
@@ -8123,7 +8156,7 @@
         </w:tc>
         <w:tc>
           <w:tcPr>
-            <w:tcW w:type="dxa" w:w="4536"/>
+            <w:tcW w:type="dxa" w:w="5159"/>
           </w:tcPr>
           <w:p>
             <w:pPr>
@@ -8141,7 +8174,7 @@
       <w:tr>
         <w:tc>
           <w:tcPr>
-            <w:tcW w:type="dxa" w:w="4536"/>
+            <w:tcW w:type="dxa" w:w="3912"/>
           </w:tcPr>
           <w:p>
             <w:pPr>
@@ -8157,7 +8190,7 @@
         </w:tc>
         <w:tc>
           <w:tcPr>
-            <w:tcW w:type="dxa" w:w="4536"/>
+            <w:tcW w:type="dxa" w:w="5159"/>
           </w:tcPr>
           <w:p>
             <w:pPr>
@@ -8259,6 +8292,7 @@
       <w:tblPr>
         <w:tblW w:type="auto" w:w="0"/>
         <w:jc w:val="center"/>
+        <w:tblLayout w:type="fixed"/>
         <w:tblLook w:firstColumn="1" w:firstRow="1" w:lastColumn="0" w:lastRow="0" w:noHBand="0" w:noVBand="1" w:val="04A0"/>
         <w:tblBorders>
           <w:top w:val="single" w:sz="6" w:color="000000"/>
@@ -8270,15 +8304,15 @@
         </w:tblBorders>
       </w:tblPr>
       <w:tblGrid>
-        <w:gridCol w:w="2268"/>
-        <w:gridCol w:w="2268"/>
-        <w:gridCol w:w="2268"/>
-        <w:gridCol w:w="2268"/>
+        <w:gridCol w:w="2391"/>
+        <w:gridCol w:w="2144"/>
+        <w:gridCol w:w="2226"/>
+        <w:gridCol w:w="2309"/>
       </w:tblGrid>
       <w:tr>
         <w:tc>
           <w:tcPr>
-            <w:tcW w:type="dxa" w:w="2268"/>
+            <w:tcW w:type="dxa" w:w="2391"/>
             <w:tcBorders>
               <w:bottom w:val="single" w:sz="4" w:color="000000"/>
             </w:tcBorders>
@@ -8298,7 +8332,7 @@
         </w:tc>
         <w:tc>
           <w:tcPr>
-            <w:tcW w:type="dxa" w:w="2268"/>
+            <w:tcW w:type="dxa" w:w="2144"/>
             <w:tcBorders>
               <w:bottom w:val="single" w:sz="4" w:color="000000"/>
             </w:tcBorders>
@@ -8318,7 +8352,7 @@
         </w:tc>
         <w:tc>
           <w:tcPr>
-            <w:tcW w:type="dxa" w:w="2268"/>
+            <w:tcW w:type="dxa" w:w="2226"/>
             <w:tcBorders>
               <w:bottom w:val="single" w:sz="4" w:color="000000"/>
             </w:tcBorders>
@@ -8338,7 +8372,7 @@
         </w:tc>
         <w:tc>
           <w:tcPr>
-            <w:tcW w:type="dxa" w:w="2268"/>
+            <w:tcW w:type="dxa" w:w="2309"/>
             <w:tcBorders>
               <w:bottom w:val="single" w:sz="4" w:color="000000"/>
             </w:tcBorders>
@@ -8360,7 +8394,7 @@
       <w:tr>
         <w:tc>
           <w:tcPr>
-            <w:tcW w:type="dxa" w:w="2268"/>
+            <w:tcW w:type="dxa" w:w="2391"/>
           </w:tcPr>
           <w:p>
             <w:pPr>
@@ -8376,7 +8410,7 @@
         </w:tc>
         <w:tc>
           <w:tcPr>
-            <w:tcW w:type="dxa" w:w="2268"/>
+            <w:tcW w:type="dxa" w:w="2144"/>
           </w:tcPr>
           <w:p>
             <w:pPr>
@@ -8392,7 +8426,7 @@
         </w:tc>
         <w:tc>
           <w:tcPr>
-            <w:tcW w:type="dxa" w:w="2268"/>
+            <w:tcW w:type="dxa" w:w="2226"/>
           </w:tcPr>
           <w:p>
             <w:pPr>
@@ -8408,7 +8442,7 @@
         </w:tc>
         <w:tc>
           <w:tcPr>
-            <w:tcW w:type="dxa" w:w="2268"/>
+            <w:tcW w:type="dxa" w:w="2309"/>
           </w:tcPr>
           <w:p>
             <w:pPr>
@@ -8426,7 +8460,7 @@
       <w:tr>
         <w:tc>
           <w:tcPr>
-            <w:tcW w:type="dxa" w:w="2268"/>
+            <w:tcW w:type="dxa" w:w="2391"/>
           </w:tcPr>
           <w:p>
             <w:pPr>
@@ -8442,7 +8476,7 @@
         </w:tc>
         <w:tc>
           <w:tcPr>
-            <w:tcW w:type="dxa" w:w="2268"/>
+            <w:tcW w:type="dxa" w:w="2144"/>
           </w:tcPr>
           <w:p>
             <w:pPr>
@@ -8458,7 +8492,7 @@
         </w:tc>
         <w:tc>
           <w:tcPr>
-            <w:tcW w:type="dxa" w:w="2268"/>
+            <w:tcW w:type="dxa" w:w="2226"/>
           </w:tcPr>
           <w:p>
             <w:pPr>
@@ -8474,7 +8508,7 @@
         </w:tc>
         <w:tc>
           <w:tcPr>
-            <w:tcW w:type="dxa" w:w="2268"/>
+            <w:tcW w:type="dxa" w:w="2309"/>
           </w:tcPr>
           <w:p>
             <w:pPr>
@@ -8492,7 +8526,7 @@
       <w:tr>
         <w:tc>
           <w:tcPr>
-            <w:tcW w:type="dxa" w:w="2268"/>
+            <w:tcW w:type="dxa" w:w="2391"/>
           </w:tcPr>
           <w:p>
             <w:pPr>
@@ -8508,7 +8542,7 @@
         </w:tc>
         <w:tc>
           <w:tcPr>
-            <w:tcW w:type="dxa" w:w="2268"/>
+            <w:tcW w:type="dxa" w:w="2144"/>
           </w:tcPr>
           <w:p>
             <w:pPr>
@@ -8524,7 +8558,7 @@
         </w:tc>
         <w:tc>
           <w:tcPr>
-            <w:tcW w:type="dxa" w:w="2268"/>
+            <w:tcW w:type="dxa" w:w="2226"/>
           </w:tcPr>
           <w:p>
             <w:pPr>
@@ -8540,7 +8574,7 @@
         </w:tc>
         <w:tc>
           <w:tcPr>
-            <w:tcW w:type="dxa" w:w="2268"/>
+            <w:tcW w:type="dxa" w:w="2309"/>
           </w:tcPr>
           <w:p>
             <w:pPr>
@@ -8558,7 +8592,7 @@
       <w:tr>
         <w:tc>
           <w:tcPr>
-            <w:tcW w:type="dxa" w:w="2268"/>
+            <w:tcW w:type="dxa" w:w="2391"/>
           </w:tcPr>
           <w:p>
             <w:pPr>
@@ -8574,7 +8608,7 @@
         </w:tc>
         <w:tc>
           <w:tcPr>
-            <w:tcW w:type="dxa" w:w="2268"/>
+            <w:tcW w:type="dxa" w:w="2144"/>
           </w:tcPr>
           <w:p>
             <w:pPr>
@@ -8590,7 +8624,7 @@
         </w:tc>
         <w:tc>
           <w:tcPr>
-            <w:tcW w:type="dxa" w:w="2268"/>
+            <w:tcW w:type="dxa" w:w="2226"/>
           </w:tcPr>
           <w:p>
             <w:pPr>
@@ -8606,7 +8640,7 @@
         </w:tc>
         <w:tc>
           <w:tcPr>
-            <w:tcW w:type="dxa" w:w="2268"/>
+            <w:tcW w:type="dxa" w:w="2309"/>
           </w:tcPr>
           <w:p>
             <w:pPr>
@@ -8624,7 +8658,7 @@
       <w:tr>
         <w:tc>
           <w:tcPr>
-            <w:tcW w:type="dxa" w:w="2268"/>
+            <w:tcW w:type="dxa" w:w="2391"/>
           </w:tcPr>
           <w:p>
             <w:pPr>
@@ -8640,7 +8674,7 @@
         </w:tc>
         <w:tc>
           <w:tcPr>
-            <w:tcW w:type="dxa" w:w="2268"/>
+            <w:tcW w:type="dxa" w:w="2144"/>
           </w:tcPr>
           <w:p>
             <w:pPr>
@@ -8656,7 +8690,7 @@
         </w:tc>
         <w:tc>
           <w:tcPr>
-            <w:tcW w:type="dxa" w:w="2268"/>
+            <w:tcW w:type="dxa" w:w="2226"/>
           </w:tcPr>
           <w:p>
             <w:pPr>
@@ -8672,7 +8706,7 @@
         </w:tc>
         <w:tc>
           <w:tcPr>
-            <w:tcW w:type="dxa" w:w="2268"/>
+            <w:tcW w:type="dxa" w:w="2309"/>
           </w:tcPr>
           <w:p>
             <w:pPr>
@@ -8690,7 +8724,7 @@
       <w:tr>
         <w:tc>
           <w:tcPr>
-            <w:tcW w:type="dxa" w:w="2268"/>
+            <w:tcW w:type="dxa" w:w="2391"/>
           </w:tcPr>
           <w:p>
             <w:pPr>
@@ -8706,7 +8740,7 @@
         </w:tc>
         <w:tc>
           <w:tcPr>
-            <w:tcW w:type="dxa" w:w="2268"/>
+            <w:tcW w:type="dxa" w:w="2144"/>
           </w:tcPr>
           <w:p>
             <w:pPr>
@@ -8722,7 +8756,7 @@
         </w:tc>
         <w:tc>
           <w:tcPr>
-            <w:tcW w:type="dxa" w:w="2268"/>
+            <w:tcW w:type="dxa" w:w="2226"/>
           </w:tcPr>
           <w:p>
             <w:pPr>
@@ -8738,7 +8772,7 @@
         </w:tc>
         <w:tc>
           <w:tcPr>
-            <w:tcW w:type="dxa" w:w="2268"/>
+            <w:tcW w:type="dxa" w:w="2309"/>
           </w:tcPr>
           <w:p>
             <w:pPr>
@@ -8909,7 +8943,7 @@
       <w:r>
         <w:drawing>
           <wp:inline xmlns:a="http://schemas.openxmlformats.org/drawingml/2006/main" xmlns:pic="http://schemas.openxmlformats.org/drawingml/2006/picture">
-            <wp:extent cx="5580000" cy="6103125"/>
+            <wp:extent cx="4772571" cy="5220000"/>
             <wp:docPr id="7" name="Picture 7"/>
             <wp:cNvGraphicFramePr>
               <a:graphicFrameLocks noChangeAspect="1"/>
@@ -8930,7 +8964,7 @@
                   <pic:spPr>
                     <a:xfrm>
                       <a:off x="0" y="0"/>
-                      <a:ext cx="5580000" cy="6103125"/>
+                      <a:ext cx="4772571" cy="5220000"/>
                     </a:xfrm>
                     <a:prstGeom prst="rect"/>
                   </pic:spPr>
@@ -9078,7 +9112,7 @@
       <w:r>
         <w:drawing>
           <wp:inline xmlns:a="http://schemas.openxmlformats.org/drawingml/2006/main" xmlns:pic="http://schemas.openxmlformats.org/drawingml/2006/picture">
-            <wp:extent cx="5580000" cy="6385895"/>
+            <wp:extent cx="4561239" cy="5219999"/>
             <wp:docPr id="8" name="Picture 8"/>
             <wp:cNvGraphicFramePr>
               <a:graphicFrameLocks noChangeAspect="1"/>
@@ -9099,7 +9133,7 @@
                   <pic:spPr>
                     <a:xfrm>
                       <a:off x="0" y="0"/>
-                      <a:ext cx="5580000" cy="6385895"/>
+                      <a:ext cx="4561239" cy="5219999"/>
                     </a:xfrm>
                     <a:prstGeom prst="rect"/>
                   </pic:spPr>
@@ -9364,6 +9398,20 @@
         <w:rPr>
           <w:b/>
         </w:rPr>
+        <w:t>The gate fits existing change-control routes.</w:t>
+      </w:r>
+      <w:r>
+        <w:t xml:space="preserve"> A vendor could list recalibration and local adaptation as pre-specified modifications in a change control plan or in the technical documentation, with CAB's tests as their acceptance criteria and blocking as the fallback [24,25]. The gate's output, the remedy chosen with its confidence bounds, is then a ready-made record for the regulator and for post-market monitoring. This is our reading of the frameworks, not regulatory advice, and whether a hospital-run test can serve as a manufacturer's acceptance test is a question for regulators.</w:t>
+      </w:r>
+    </w:p>
+    <w:p>
+      <w:pPr>
+        <w:jc w:val="both"/>
+      </w:pPr>
+      <w:r>
+        <w:rPr>
+          <w:b/>
+        </w:rPr>
         <w:t>Order saves labels.</w:t>
       </w:r>
       <w:r>
@@ -9473,7 +9521,7 @@
         <w:t>No monitoring after deployment.</w:t>
       </w:r>
       <w:r>
-        <w:t xml:space="preserve"> The guarantee covers the decision at deployment, not drift afterwards.</w:t>
+        <w:t xml:space="preserve"> The guarantee covers the decision at deployment, not drift afterwards, which both regulatory frameworks expect to be monitored [24,25].</w:t>
       </w:r>
     </w:p>
     <w:p>
@@ -9913,6 +9961,83 @@
           <w:sz w:val="18"/>
         </w:rPr>
         <w:t>19. Angelopoulos AN, Bates S, Fannjiang C, Jordan MI, Zrnic T. Prediction-powered inference. Science. 2023;382(6671):669–674.</w:t>
+      </w:r>
+    </w:p>
+    <w:p>
+      <w:pPr>
+        <w:ind w:left="397" w:hanging="397"/>
+      </w:pPr>
+      <w:r>
+        <w:rPr>
+          <w:sz w:val="18"/>
+        </w:rPr>
+        <w:t>20. Wong A, Currey D, Schwinne M, et al. Multicenter prospective validation of an updated proprietary sepsis prediction model. JAMA Netw Open. 2026;9(2):e260181. doi:10.1001/jamanetworkopen.2026.0181</w:t>
+      </w:r>
+    </w:p>
+    <w:p>
+      <w:pPr>
+        <w:ind w:left="397" w:hanging="397"/>
+      </w:pPr>
+      <w:r>
+        <w:rPr>
+          <w:sz w:val="18"/>
+        </w:rPr>
+        <w:t>21. Kamran F, Tjandra D, Heiler A, et al. Evaluation of sepsis prediction models before onset of treatment. NEJM AI. 2024;1(3). doi:10.1056/AIoa2300032</w:t>
+      </w:r>
+    </w:p>
+    <w:p>
+      <w:pPr>
+        <w:ind w:left="397" w:hanging="397"/>
+      </w:pPr>
+      <w:r>
+        <w:rPr>
+          <w:sz w:val="18"/>
+        </w:rPr>
+        <w:t>22. Moor M, Bennett N, Plečko D, et al. Predicting sepsis using deep learning across international sites: a retrospective development and validation study. eClinicalMedicine. 2023;62:102124. doi:10.1016/j.eclinm.2023.102124</w:t>
+      </w:r>
+    </w:p>
+    <w:p>
+      <w:pPr>
+        <w:ind w:left="397" w:hanging="397"/>
+      </w:pPr>
+      <w:r>
+        <w:rPr>
+          <w:sz w:val="18"/>
+        </w:rPr>
+        <w:t>23. Angelopoulos AN, Bates S, Fisch A, Lei L, Schuster T. Conformal risk control. In: Proc. 12th Int. Conf. Learning Representations (ICLR). 2024.</w:t>
+      </w:r>
+    </w:p>
+    <w:p>
+      <w:pPr>
+        <w:ind w:left="397" w:hanging="397"/>
+      </w:pPr>
+      <w:r>
+        <w:rPr>
+          <w:sz w:val="18"/>
+        </w:rPr>
+        <w:t>24. U.S. Food and Drug Administration. Marketing submission recommendations for a predetermined change control plan for artificial intelligence-enabled device software functions: guidance for industry and Food and Drug Administration staff. Final guidance, December 2024 (current version August 2025). Docket FDA-2022-D-2628.</w:t>
+      </w:r>
+    </w:p>
+    <w:p>
+      <w:pPr>
+        <w:ind w:left="397" w:hanging="397"/>
+      </w:pPr>
+      <w:r>
+        <w:rPr>
+          <w:sz w:val="18"/>
+        </w:rPr>
+        <w:t>25. Regulation (EU) 2024/1689 of the European Parliament and of the Council of 13 June 2024 laying down harmonised rules on artificial intelligence (Artificial Intelligence Act). Off J Eur Union. 2024;L 2024/1689.</w:t>
+      </w:r>
+    </w:p>
+    <w:p>
+      <w:pPr>
+        <w:ind w:left="397" w:hanging="397"/>
+      </w:pPr>
+      <w:r>
+        <w:rPr>
+          <w:sz w:val="18"/>
+        </w:rPr>
+        <w:t>26. Regulation (EU) 2026/1744 of the European Parliament and of the Council of 8 July 2026 amending Regulation (EU) 2024/1689 (Digital Omnibus on AI). Off J Eur Union. 24 July 2026.</w:t>
       </w:r>
     </w:p>
     <w:sectPr>

</xml_diff>